<commit_message>
📄 Actualizar registro Word [28-09-2026 01:04]
</commit_message>
<xml_diff>
--- a/registro_2026.docx
+++ b/registro_2026.docx
@@ -17911,10 +17911,6 @@
     </w:sectPr>
   </w:body>
 </w:document>
-</file>
-
-<file path=word/comments.xml><?xml version="1.0" encoding="utf-8"?>
-<w:comments xmlns:cx="http://schemas.microsoft.com/office/drawing/2014/chartex" xmlns:cx1="http://schemas.microsoft.com/office/drawing/2015/9/8/chartex" xmlns:cx2="http://schemas.microsoft.com/office/drawing/2015/10/21/chartex" xmlns:cx3="http://schemas.microsoft.com/office/drawing/2016/5/9/chartex" xmlns:cx4="http://schemas.microsoft.com/office/drawing/2016/5/10/chartex" xmlns:cx5="http://schemas.microsoft.com/office/drawing/2016/5/11/chartex" xmlns:cx6="http://schemas.microsoft.com/office/drawing/2016/5/12/chartex" xmlns:cx7="http://schemas.microsoft.com/office/drawing/2016/5/13/chartex" xmlns:cx8="http://schemas.microsoft.com/office/drawing/2016/5/14/chartex" xmlns:mc="http://schemas.openxmlformats.org/markup-compatibility/2006" xmlns:aink="http://schemas.microsoft.com/office/drawing/2016/ink" xmlns:am3d="http://schemas.microsoft.com/office/drawing/2017/model3d" xmlns:o="urn:schemas-microsoft-com:office:office" xmlns:r="http://schemas.openxmlformats.org/officeDocument/2006/relationships" xmlns:m="http://schemas.openxmlformats.org/officeDocument/2006/math" xmlns:v="urn:schemas-microsoft-com:vml" xmlns:wp14="http://schemas.microsoft.com/office/word/2010/wordprocessingDrawing" xmlns:wp="http://schemas.openxmlformats.org/drawingml/2006/wordprocessingDrawing" xmlns:w10="urn:schemas-microsoft-com:office:word" xmlns:w="http://schemas.openxmlformats.org/wordprocessingml/2006/main" xmlns:w14="http://schemas.microsoft.com/office/word/2010/wordml" xmlns:w15="http://schemas.microsoft.com/office/word/2012/wordml" xmlns:w16cex="http://schemas.microsoft.com/office/word/2018/wordml/cex" xmlns:w16cid="http://schemas.microsoft.com/office/word/2016/wordml/cid" xmlns:w16="http://schemas.microsoft.com/office/word/2018/wordml" xmlns:w16sdtdh="http://schemas.microsoft.com/office/word/2020/wordml/sdtdatahash" xmlns:w16se="http://schemas.microsoft.com/office/word/2015/wordml/symex" xmlns:wpg="http://schemas.microsoft.com/office/word/2010/wordprocessingGroup" xmlns:wpi="http://schemas.microsoft.com/office/word/2010/wordprocessingInk" xmlns:wne="http://schemas.microsoft.com/office/word/2006/wordml" xmlns:wps="http://schemas.microsoft.com/office/word/2010/wordprocessingShape"/>
 </file>
 
 <file path=word/endnotes.xml><?xml version="1.0" encoding="utf-8"?>
@@ -17995,7 +17991,7 @@
 <w:numbering xmlns:wpc="http://schemas.microsoft.com/office/word/2010/wordprocessingCanvas" xmlns:mc="http://schemas.openxmlformats.org/markup-compatibility/2006" xmlns:o="urn:schemas-microsoft-com:office:office" xmlns:r="http://schemas.openxmlformats.org/officeDocument/2006/relationships" xmlns:m="http://schemas.openxmlformats.org/officeDocument/2006/math" xmlns:v="urn:schemas-microsoft-com:vml" xmlns:wp14="http://schemas.microsoft.com/office/word/2010/wordprocessingDrawing" xmlns:wp="http://schemas.openxmlformats.org/drawingml/2006/wordprocessingDrawing" xmlns:w10="urn:schemas-microsoft-com:office:word" xmlns:w="http://schemas.openxmlformats.org/wordprocessingml/2006/main" xmlns:w14="http://schemas.microsoft.com/office/word/2010/wordml" xmlns:w15="http://schemas.microsoft.com/office/word/2012/wordml" xmlns:wpg="http://schemas.microsoft.com/office/word/2010/wordprocessingGroup" xmlns:wpi="http://schemas.microsoft.com/office/word/2010/wordprocessingInk" xmlns:wne="http://schemas.microsoft.com/office/word/2006/wordml" xmlns:wps="http://schemas.microsoft.com/office/word/2010/wordprocessingShape" mc:Ignorable="w14 w15 wp14">
   <w:abstractNum w:abstractNumId="1" w15:restartNumberingAfterBreak="0">
     <w:multiLevelType w:val="hybridMultilevel"/>
-    <w:lvl w:ilvl="0" w15:tentative="1">
+    <w:lvl w:ilvl="0" w:tentative="1">
       <w:start w:val="1"/>
       <w:numFmt w:val="bullet"/>
       <w:lvlText w:val="●"/>
@@ -18004,7 +18000,7 @@
         <w:ind w:left="720" w:hanging="360"/>
       </w:pPr>
     </w:lvl>
-    <w:lvl w:ilvl="1" w15:tentative="1">
+    <w:lvl w:ilvl="1" w:tentative="1">
       <w:start w:val="1"/>
       <w:numFmt w:val="bullet"/>
       <w:lvlText w:val="○"/>
@@ -18013,7 +18009,7 @@
         <w:ind w:left="1440" w:hanging="360"/>
       </w:pPr>
     </w:lvl>
-    <w:lvl w:ilvl="2" w15:tentative="1">
+    <w:lvl w:ilvl="2" w:tentative="1">
       <w:start w:val="1"/>
       <w:numFmt w:val="bullet"/>
       <w:lvlText w:val="■"/>
@@ -18022,7 +18018,7 @@
         <w:ind w:left="2160" w:hanging="360"/>
       </w:pPr>
     </w:lvl>
-    <w:lvl w:ilvl="3" w15:tentative="1">
+    <w:lvl w:ilvl="3" w:tentative="1">
       <w:start w:val="1"/>
       <w:numFmt w:val="bullet"/>
       <w:lvlText w:val="●"/>
@@ -18031,7 +18027,7 @@
         <w:ind w:left="2880" w:hanging="360"/>
       </w:pPr>
     </w:lvl>
-    <w:lvl w:ilvl="4" w15:tentative="1">
+    <w:lvl w:ilvl="4" w:tentative="1">
       <w:start w:val="1"/>
       <w:numFmt w:val="bullet"/>
       <w:lvlText w:val="○"/>
@@ -18040,7 +18036,7 @@
         <w:ind w:left="3600" w:hanging="360"/>
       </w:pPr>
     </w:lvl>
-    <w:lvl w:ilvl="5" w15:tentative="1">
+    <w:lvl w:ilvl="5" w:tentative="1">
       <w:start w:val="1"/>
       <w:numFmt w:val="bullet"/>
       <w:lvlText w:val="■"/>
@@ -18049,7 +18045,7 @@
         <w:ind w:left="4320" w:hanging="360"/>
       </w:pPr>
     </w:lvl>
-    <w:lvl w:ilvl="6" w15:tentative="1">
+    <w:lvl w:ilvl="6" w:tentative="1">
       <w:start w:val="1"/>
       <w:numFmt w:val="bullet"/>
       <w:lvlText w:val="●"/>
@@ -18058,7 +18054,7 @@
         <w:ind w:left="5040" w:hanging="360"/>
       </w:pPr>
     </w:lvl>
-    <w:lvl w:ilvl="7" w15:tentative="1">
+    <w:lvl w:ilvl="7" w:tentative="1">
       <w:start w:val="1"/>
       <w:numFmt w:val="bullet"/>
       <w:lvlText w:val="●"/>
@@ -18067,7 +18063,7 @@
         <w:ind w:left="5760" w:hanging="360"/>
       </w:pPr>
     </w:lvl>
-    <w:lvl w:ilvl="8" w15:tentative="1">
+    <w:lvl w:ilvl="8" w:tentative="1">
       <w:start w:val="1"/>
       <w:numFmt w:val="bullet"/>
       <w:lvlText w:val="●"/>
@@ -18092,6 +18088,10 @@
     <w:rPrDefault/>
     <w:pPrDefault/>
   </w:docDefaults>
+  <w:style w:type="paragraph" w:styleId="Normal" w:default="1">
+    <w:name w:val="Normal"/>
+    <w:qFormat/>
+  </w:style>
   <w:style w:type="paragraph" w:styleId="Title">
     <w:name w:val="Title"/>
     <w:basedOn w:val="Normal"/>
@@ -18264,4 +18264,294 @@
     </w:rPr>
   </w:style>
 </w:styles>
+</file>
+
+<file path=word/theme/theme1.xml><?xml version="1.0" encoding="utf-8"?>
+<a:theme xmlns:a="http://schemas.openxmlformats.org/drawingml/2006/main" name="Office Theme">
+  <a:themeElements>
+    <a:clrScheme name="Office">
+      <a:dk1>
+        <a:sysClr val="windowText" lastClr="000000"/>
+      </a:dk1>
+      <a:lt1>
+        <a:sysClr val="window" lastClr="FFFFFF"/>
+      </a:lt1>
+      <a:dk2>
+        <a:srgbClr val="44546A"/>
+      </a:dk2>
+      <a:lt2>
+        <a:srgbClr val="E7E6E6"/>
+      </a:lt2>
+      <a:accent1>
+        <a:srgbClr val="4472C4"/>
+      </a:accent1>
+      <a:accent2>
+        <a:srgbClr val="ED7D31"/>
+      </a:accent2>
+      <a:accent3>
+        <a:srgbClr val="A5A5A5"/>
+      </a:accent3>
+      <a:accent4>
+        <a:srgbClr val="FFC000"/>
+      </a:accent4>
+      <a:accent5>
+        <a:srgbClr val="5B9BD5"/>
+      </a:accent5>
+      <a:accent6>
+        <a:srgbClr val="70AD47"/>
+      </a:accent6>
+      <a:hlink>
+        <a:srgbClr val="0563C1"/>
+      </a:hlink>
+      <a:folHlink>
+        <a:srgbClr val="954F72"/>
+      </a:folHlink>
+    </a:clrScheme>
+    <a:fontScheme name="Office">
+      <a:majorFont>
+        <a:latin typeface="Calibri Light" panose="020F0302020204030204"/>
+        <a:ea typeface=""/>
+        <a:cs typeface=""/>
+        <a:font script="Jpan" typeface="游ゴシック Light"/>
+        <a:font script="Hang" typeface="맑은 고딕"/>
+        <a:font script="Hans" typeface="等线 Light"/>
+        <a:font script="Hant" typeface="新細明體"/>
+        <a:font script="Arab" typeface="Times New Roman"/>
+        <a:font script="Hebr" typeface="Times New Roman"/>
+        <a:font script="Thai" typeface="Angsana New"/>
+        <a:font script="Ethi" typeface="Nyala"/>
+        <a:font script="Beng" typeface="Vrinda"/>
+        <a:font script="Gujr" typeface="Shruti"/>
+        <a:font script="Khmr" typeface="MoolBoran"/>
+        <a:font script="Knda" typeface="Tunga"/>
+        <a:font script="Guru" typeface="Raavi"/>
+        <a:font script="Cans" typeface="Euphemia"/>
+        <a:font script="Cher" typeface="Plantagenet Cherokee"/>
+        <a:font script="Yiii" typeface="Microsoft Yi Baiti"/>
+        <a:font script="Tibt" typeface="Microsoft Himalaya"/>
+        <a:font script="Thaa" typeface="MV Boli"/>
+        <a:font script="Deva" typeface="Mangal"/>
+        <a:font script="Telu" typeface="Gautami"/>
+        <a:font script="Taml" typeface="Latha"/>
+        <a:font script="Syrc" typeface="Estrangelo Edessa"/>
+        <a:font script="Orya" typeface="Kalinga"/>
+        <a:font script="Mlym" typeface="Kartika"/>
+        <a:font script="Laoo" typeface="DokChampa"/>
+        <a:font script="Sinh" typeface="Iskoola Pota"/>
+        <a:font script="Mong" typeface="Mongolian Baiti"/>
+        <a:font script="Viet" typeface="Times New Roman"/>
+        <a:font script="Uigh" typeface="Microsoft Uighur"/>
+        <a:font script="Geor" typeface="Sylfaen"/>
+        <a:font script="Armn" typeface="Arial"/>
+        <a:font script="Bugi" typeface="Leelawadee UI"/>
+        <a:font script="Bopo" typeface="Microsoft JhengHei"/>
+        <a:font script="Java" typeface="Javanese Text"/>
+        <a:font script="Lisu" typeface="Segoe UI"/>
+        <a:font script="Mymr" typeface="Myanmar Text"/>
+        <a:font script="Nkoo" typeface="Ebrima"/>
+        <a:font script="Olck" typeface="Nirmala UI"/>
+        <a:font script="Osma" typeface="Ebrima"/>
+        <a:font script="Phag" typeface="Phagspa"/>
+        <a:font script="Syrn" typeface="Estrangelo Edessa"/>
+        <a:font script="Syrj" typeface="Estrangelo Edessa"/>
+        <a:font script="Syre" typeface="Estrangelo Edessa"/>
+        <a:font script="Sora" typeface="Nirmala UI"/>
+        <a:font script="Tale" typeface="Microsoft Tai Le"/>
+        <a:font script="Talu" typeface="Microsoft New Tai Lue"/>
+        <a:font script="Tfng" typeface="Ebrima"/>
+      </a:majorFont>
+      <a:minorFont>
+        <a:latin typeface="Calibri" panose="020F0502020204030204"/>
+        <a:ea typeface=""/>
+        <a:cs typeface=""/>
+        <a:font script="Jpan" typeface="游明朝"/>
+        <a:font script="Hang" typeface="맑은 고딕"/>
+        <a:font script="Hans" typeface="等线"/>
+        <a:font script="Hant" typeface="新細明體"/>
+        <a:font script="Arab" typeface="Arial"/>
+        <a:font script="Hebr" typeface="Arial"/>
+        <a:font script="Thai" typeface="Cordia New"/>
+        <a:font script="Ethi" typeface="Nyala"/>
+        <a:font script="Beng" typeface="Vrinda"/>
+        <a:font script="Gujr" typeface="Shruti"/>
+        <a:font script="Khmr" typeface="DaunPenh"/>
+        <a:font script="Knda" typeface="Tunga"/>
+        <a:font script="Guru" typeface="Raavi"/>
+        <a:font script="Cans" typeface="Euphemia"/>
+        <a:font script="Cher" typeface="Plantagenet Cherokee"/>
+        <a:font script="Yiii" typeface="Microsoft Yi Baiti"/>
+        <a:font script="Tibt" typeface="Microsoft Himalaya"/>
+        <a:font script="Thaa" typeface="MV Boli"/>
+        <a:font script="Deva" typeface="Mangal"/>
+        <a:font script="Telu" typeface="Gautami"/>
+        <a:font script="Taml" typeface="Latha"/>
+        <a:font script="Syrc" typeface="Estrangelo Edessa"/>
+        <a:font script="Orya" typeface="Kalinga"/>
+        <a:font script="Mlym" typeface="Kartika"/>
+        <a:font script="Laoo" typeface="DokChampa"/>
+        <a:font script="Sinh" typeface="Iskoola Pota"/>
+        <a:font script="Mong" typeface="Mongolian Baiti"/>
+        <a:font script="Viet" typeface="Arial"/>
+        <a:font script="Uigh" typeface="Microsoft Uighur"/>
+        <a:font script="Geor" typeface="Sylfaen"/>
+        <a:font script="Armn" typeface="Arial"/>
+        <a:font script="Bugi" typeface="Leelawadee UI"/>
+        <a:font script="Bopo" typeface="Microsoft JhengHei"/>
+        <a:font script="Java" typeface="Javanese Text"/>
+        <a:font script="Lisu" typeface="Segoe UI"/>
+        <a:font script="Mymr" typeface="Myanmar Text"/>
+        <a:font script="Nkoo" typeface="Ebrima"/>
+        <a:font script="Olck" typeface="Nirmala UI"/>
+        <a:font script="Osma" typeface="Ebrima"/>
+        <a:font script="Phag" typeface="Phagspa"/>
+        <a:font script="Syrn" typeface="Estrangelo Edessa"/>
+        <a:font script="Syrj" typeface="Estrangelo Edessa"/>
+        <a:font script="Syre" typeface="Estrangelo Edessa"/>
+        <a:font script="Sora" typeface="Nirmala UI"/>
+        <a:font script="Tale" typeface="Microsoft Tai Le"/>
+        <a:font script="Talu" typeface="Microsoft New Tai Lue"/>
+        <a:font script="Tfng" typeface="Ebrima"/>
+      </a:minorFont>
+    </a:fontScheme>
+    <a:fmtScheme name="Office">
+      <a:fillStyleLst>
+        <a:solidFill>
+          <a:schemeClr val="phClr"/>
+        </a:solidFill>
+        <a:gradFill rotWithShape="true">
+          <a:gsLst>
+            <a:gs pos="0">
+              <a:schemeClr val="phClr">
+                <a:lumMod val="110000"/>
+                <a:satMod val="105000"/>
+                <a:tint val="67000"/>
+              </a:schemeClr>
+            </a:gs>
+            <a:gs pos="50000">
+              <a:schemeClr val="phClr">
+                <a:lumMod val="105000"/>
+                <a:satMod val="103000"/>
+                <a:tint val="73000"/>
+              </a:schemeClr>
+            </a:gs>
+            <a:gs pos="100000">
+              <a:schemeClr val="phClr">
+                <a:lumMod val="105000"/>
+                <a:satMod val="109000"/>
+                <a:tint val="81000"/>
+              </a:schemeClr>
+            </a:gs>
+          </a:gsLst>
+          <a:lin ang="5400000" scaled="false"/>
+        </a:gradFill>
+        <a:gradFill rotWithShape="true">
+          <a:gsLst>
+            <a:gs pos="0">
+              <a:schemeClr val="phClr">
+                <a:satMod val="103000"/>
+                <a:lumMod val="102000"/>
+                <a:tint val="94000"/>
+              </a:schemeClr>
+            </a:gs>
+            <a:gs pos="50000">
+              <a:schemeClr val="phClr">
+                <a:satMod val="110000"/>
+                <a:lumMod val="100000"/>
+                <a:shade val="100000"/>
+              </a:schemeClr>
+            </a:gs>
+            <a:gs pos="100000">
+              <a:schemeClr val="phClr">
+                <a:lumMod val="99000"/>
+                <a:satMod val="120000"/>
+                <a:shade val="78000"/>
+              </a:schemeClr>
+            </a:gs>
+          </a:gsLst>
+          <a:lin ang="5400000" scaled="false"/>
+        </a:gradFill>
+      </a:fillStyleLst>
+      <a:lnStyleLst>
+        <a:ln w="6350" cap="flat" cmpd="sng" algn="ctr">
+          <a:solidFill>
+            <a:schemeClr val="phClr"/>
+          </a:solidFill>
+          <a:prstDash val="solid"/>
+          <a:miter lim="800000"/>
+        </a:ln>
+        <a:ln w="12700" cap="flat" cmpd="sng" algn="ctr">
+          <a:solidFill>
+            <a:schemeClr val="phClr"/>
+          </a:solidFill>
+          <a:prstDash val="solid"/>
+          <a:miter lim="800000"/>
+        </a:ln>
+        <a:ln w="19050" cap="flat" cmpd="sng" algn="ctr">
+          <a:solidFill>
+            <a:schemeClr val="phClr"/>
+          </a:solidFill>
+          <a:prstDash val="solid"/>
+          <a:miter lim="800000"/>
+        </a:ln>
+      </a:lnStyleLst>
+      <a:effectStyleLst>
+        <a:effectStyle>
+          <a:effectLst/>
+        </a:effectStyle>
+        <a:effectStyle>
+          <a:effectLst/>
+        </a:effectStyle>
+        <a:effectStyle>
+          <a:effectLst>
+            <a:outerShdw blurRad="57150" dist="19050" dir="5400000" algn="ctr" rotWithShape="false">
+              <a:srgbClr val="000000">
+                <a:alpha val="63000"/>
+              </a:srgbClr>
+            </a:outerShdw>
+          </a:effectLst>
+        </a:effectStyle>
+      </a:effectStyleLst>
+      <a:bgFillStyleLst>
+        <a:solidFill>
+          <a:schemeClr val="phClr"/>
+        </a:solidFill>
+        <a:solidFill>
+          <a:schemeClr val="phClr">
+            <a:tint val="95000"/>
+            <a:satMod val="170000"/>
+          </a:schemeClr>
+        </a:solidFill>
+        <a:gradFill rotWithShape="true">
+          <a:gsLst>
+            <a:gs pos="0">
+              <a:schemeClr val="phClr">
+                <a:tint val="93000"/>
+                <a:satMod val="150000"/>
+                <a:shade val="98000"/>
+                <a:lumMod val="102000"/>
+              </a:schemeClr>
+            </a:gs>
+            <a:gs pos="50000">
+              <a:schemeClr val="phClr">
+                <a:tint val="98000"/>
+                <a:satMod val="130000"/>
+                <a:shade val="90000"/>
+                <a:lumMod val="103000"/>
+              </a:schemeClr>
+            </a:gs>
+            <a:gs pos="100000">
+              <a:schemeClr val="phClr">
+                <a:shade val="63000"/>
+                <a:satMod val="120000"/>
+              </a:schemeClr>
+            </a:gs>
+          </a:gsLst>
+          <a:lin ang="5400000" scaled="false"/>
+        </a:gradFill>
+      </a:bgFillStyleLst>
+    </a:fmtScheme>
+  </a:themeElements>
+  <a:objectDefaults/>
+  <a:extraClrSchemeLst/>
+</a:theme>
 </file>
</xml_diff>

<commit_message>
📄 Actualizar registro Word [07-10-2026 05:46]
</commit_message>
<xml_diff>
--- a/registro_2026.docx
+++ b/registro_2026.docx
@@ -347,6 +347,7 @@
         </w:trPr>
         <w:tc>
           <w:tcPr>
+            <w:tcW w:type="dxa" w:w="709"/>
             <w:gridSpan w:val="1"/>
             <w:vMerge w:val="continue"/>
             <w:tcBorders>
@@ -360,6 +361,7 @@
         </w:tc>
         <w:tc>
           <w:tcPr>
+            <w:tcW w:type="dxa" w:w="1276"/>
             <w:gridSpan w:val="1"/>
             <w:vMerge w:val="continue"/>
             <w:tcBorders>
@@ -877,6 +879,7 @@
       <w:tr>
         <w:tc>
           <w:tcPr>
+            <w:tcW w:type="dxa" w:w="709"/>
             <w:gridSpan w:val="1"/>
             <w:vMerge w:val="continue"/>
             <w:tcBorders>
@@ -890,6 +893,7 @@
         </w:tc>
         <w:tc>
           <w:tcPr>
+            <w:tcW w:type="dxa" w:w="1276"/>
             <w:gridSpan w:val="1"/>
             <w:vMerge w:val="continue"/>
             <w:tcBorders>
@@ -1399,6 +1403,7 @@
       <w:tr>
         <w:tc>
           <w:tcPr>
+            <w:tcW w:type="dxa" w:w="709"/>
             <w:gridSpan w:val="1"/>
             <w:vMerge w:val="continue"/>
             <w:tcBorders>
@@ -1412,6 +1417,7 @@
         </w:tc>
         <w:tc>
           <w:tcPr>
+            <w:tcW w:type="dxa" w:w="1276"/>
             <w:gridSpan w:val="1"/>
             <w:vMerge w:val="continue"/>
             <w:tcBorders>
@@ -1921,6 +1927,7 @@
       <w:tr>
         <w:tc>
           <w:tcPr>
+            <w:tcW w:type="dxa" w:w="709"/>
             <w:gridSpan w:val="1"/>
             <w:vMerge w:val="continue"/>
             <w:tcBorders>
@@ -1934,6 +1941,7 @@
         </w:tc>
         <w:tc>
           <w:tcPr>
+            <w:tcW w:type="dxa" w:w="1276"/>
             <w:gridSpan w:val="1"/>
             <w:vMerge w:val="continue"/>
             <w:tcBorders>
@@ -2443,6 +2451,7 @@
       <w:tr>
         <w:tc>
           <w:tcPr>
+            <w:tcW w:type="dxa" w:w="709"/>
             <w:gridSpan w:val="1"/>
             <w:vMerge w:val="continue"/>
             <w:tcBorders>
@@ -2456,6 +2465,7 @@
         </w:tc>
         <w:tc>
           <w:tcPr>
+            <w:tcW w:type="dxa" w:w="1276"/>
             <w:gridSpan w:val="1"/>
             <w:vMerge w:val="continue"/>
             <w:tcBorders>
@@ -2965,6 +2975,7 @@
       <w:tr>
         <w:tc>
           <w:tcPr>
+            <w:tcW w:type="dxa" w:w="709"/>
             <w:gridSpan w:val="1"/>
             <w:vMerge w:val="continue"/>
             <w:tcBorders>
@@ -2978,6 +2989,7 @@
         </w:tc>
         <w:tc>
           <w:tcPr>
+            <w:tcW w:type="dxa" w:w="1276"/>
             <w:gridSpan w:val="1"/>
             <w:vMerge w:val="continue"/>
             <w:tcBorders>
@@ -3487,6 +3499,7 @@
       <w:tr>
         <w:tc>
           <w:tcPr>
+            <w:tcW w:type="dxa" w:w="709"/>
             <w:gridSpan w:val="1"/>
             <w:vMerge w:val="continue"/>
             <w:tcBorders>
@@ -3500,6 +3513,7 @@
         </w:tc>
         <w:tc>
           <w:tcPr>
+            <w:tcW w:type="dxa" w:w="1276"/>
             <w:gridSpan w:val="1"/>
             <w:vMerge w:val="continue"/>
             <w:tcBorders>
@@ -4009,6 +4023,7 @@
       <w:tr>
         <w:tc>
           <w:tcPr>
+            <w:tcW w:type="dxa" w:w="709"/>
             <w:gridSpan w:val="1"/>
             <w:vMerge w:val="continue"/>
             <w:tcBorders>
@@ -4022,6 +4037,7 @@
         </w:tc>
         <w:tc>
           <w:tcPr>
+            <w:tcW w:type="dxa" w:w="1276"/>
             <w:gridSpan w:val="1"/>
             <w:vMerge w:val="continue"/>
             <w:tcBorders>
@@ -4531,6 +4547,7 @@
       <w:tr>
         <w:tc>
           <w:tcPr>
+            <w:tcW w:type="dxa" w:w="709"/>
             <w:gridSpan w:val="1"/>
             <w:vMerge w:val="continue"/>
             <w:tcBorders>
@@ -4544,6 +4561,7 @@
         </w:tc>
         <w:tc>
           <w:tcPr>
+            <w:tcW w:type="dxa" w:w="1276"/>
             <w:gridSpan w:val="1"/>
             <w:vMerge w:val="continue"/>
             <w:tcBorders>
@@ -5053,6 +5071,7 @@
       <w:tr>
         <w:tc>
           <w:tcPr>
+            <w:tcW w:type="dxa" w:w="709"/>
             <w:gridSpan w:val="1"/>
             <w:vMerge w:val="continue"/>
             <w:tcBorders>
@@ -5066,6 +5085,7 @@
         </w:tc>
         <w:tc>
           <w:tcPr>
+            <w:tcW w:type="dxa" w:w="1276"/>
             <w:gridSpan w:val="1"/>
             <w:vMerge w:val="continue"/>
             <w:tcBorders>
@@ -5575,6 +5595,7 @@
       <w:tr>
         <w:tc>
           <w:tcPr>
+            <w:tcW w:type="dxa" w:w="709"/>
             <w:gridSpan w:val="1"/>
             <w:vMerge w:val="continue"/>
             <w:tcBorders>
@@ -5588,6 +5609,7 @@
         </w:tc>
         <w:tc>
           <w:tcPr>
+            <w:tcW w:type="dxa" w:w="1276"/>
             <w:gridSpan w:val="1"/>
             <w:vMerge w:val="continue"/>
             <w:tcBorders>
@@ -6097,6 +6119,7 @@
       <w:tr>
         <w:tc>
           <w:tcPr>
+            <w:tcW w:type="dxa" w:w="709"/>
             <w:gridSpan w:val="1"/>
             <w:vMerge w:val="continue"/>
             <w:tcBorders>
@@ -6110,6 +6133,7 @@
         </w:tc>
         <w:tc>
           <w:tcPr>
+            <w:tcW w:type="dxa" w:w="1276"/>
             <w:gridSpan w:val="1"/>
             <w:vMerge w:val="continue"/>
             <w:tcBorders>
@@ -6619,6 +6643,7 @@
       <w:tr>
         <w:tc>
           <w:tcPr>
+            <w:tcW w:type="dxa" w:w="709"/>
             <w:gridSpan w:val="1"/>
             <w:vMerge w:val="continue"/>
             <w:tcBorders>
@@ -6632,6 +6657,7 @@
         </w:tc>
         <w:tc>
           <w:tcPr>
+            <w:tcW w:type="dxa" w:w="1276"/>
             <w:gridSpan w:val="1"/>
             <w:vMerge w:val="continue"/>
             <w:tcBorders>
@@ -7141,6 +7167,7 @@
       <w:tr>
         <w:tc>
           <w:tcPr>
+            <w:tcW w:type="dxa" w:w="709"/>
             <w:gridSpan w:val="1"/>
             <w:vMerge w:val="continue"/>
             <w:tcBorders>
@@ -7154,6 +7181,7 @@
         </w:tc>
         <w:tc>
           <w:tcPr>
+            <w:tcW w:type="dxa" w:w="1276"/>
             <w:gridSpan w:val="1"/>
             <w:vMerge w:val="continue"/>
             <w:tcBorders>
@@ -7663,6 +7691,7 @@
       <w:tr>
         <w:tc>
           <w:tcPr>
+            <w:tcW w:type="dxa" w:w="709"/>
             <w:gridSpan w:val="1"/>
             <w:vMerge w:val="continue"/>
             <w:tcBorders>
@@ -7676,6 +7705,7 @@
         </w:tc>
         <w:tc>
           <w:tcPr>
+            <w:tcW w:type="dxa" w:w="1276"/>
             <w:gridSpan w:val="1"/>
             <w:vMerge w:val="continue"/>
             <w:tcBorders>
@@ -8185,6 +8215,7 @@
       <w:tr>
         <w:tc>
           <w:tcPr>
+            <w:tcW w:type="dxa" w:w="709"/>
             <w:gridSpan w:val="1"/>
             <w:vMerge w:val="continue"/>
             <w:tcBorders>
@@ -8198,6 +8229,7 @@
         </w:tc>
         <w:tc>
           <w:tcPr>
+            <w:tcW w:type="dxa" w:w="1276"/>
             <w:gridSpan w:val="1"/>
             <w:vMerge w:val="continue"/>
             <w:tcBorders>
@@ -8707,6 +8739,7 @@
       <w:tr>
         <w:tc>
           <w:tcPr>
+            <w:tcW w:type="dxa" w:w="709"/>
             <w:gridSpan w:val="1"/>
             <w:vMerge w:val="continue"/>
             <w:tcBorders>
@@ -8720,6 +8753,7 @@
         </w:tc>
         <w:tc>
           <w:tcPr>
+            <w:tcW w:type="dxa" w:w="1276"/>
             <w:gridSpan w:val="1"/>
             <w:vMerge w:val="continue"/>
             <w:tcBorders>
@@ -9229,6 +9263,7 @@
       <w:tr>
         <w:tc>
           <w:tcPr>
+            <w:tcW w:type="dxa" w:w="709"/>
             <w:gridSpan w:val="1"/>
             <w:vMerge w:val="continue"/>
             <w:tcBorders>
@@ -9242,6 +9277,7 @@
         </w:tc>
         <w:tc>
           <w:tcPr>
+            <w:tcW w:type="dxa" w:w="1276"/>
             <w:gridSpan w:val="1"/>
             <w:vMerge w:val="continue"/>
             <w:tcBorders>
@@ -9751,6 +9787,7 @@
       <w:tr>
         <w:tc>
           <w:tcPr>
+            <w:tcW w:type="dxa" w:w="709"/>
             <w:gridSpan w:val="1"/>
             <w:vMerge w:val="continue"/>
             <w:tcBorders>
@@ -9764,6 +9801,7 @@
         </w:tc>
         <w:tc>
           <w:tcPr>
+            <w:tcW w:type="dxa" w:w="1276"/>
             <w:gridSpan w:val="1"/>
             <w:vMerge w:val="continue"/>
             <w:tcBorders>
@@ -10273,6 +10311,7 @@
       <w:tr>
         <w:tc>
           <w:tcPr>
+            <w:tcW w:type="dxa" w:w="709"/>
             <w:gridSpan w:val="1"/>
             <w:vMerge w:val="continue"/>
             <w:tcBorders>
@@ -10286,6 +10325,7 @@
         </w:tc>
         <w:tc>
           <w:tcPr>
+            <w:tcW w:type="dxa" w:w="1276"/>
             <w:gridSpan w:val="1"/>
             <w:vMerge w:val="continue"/>
             <w:tcBorders>
@@ -10795,6 +10835,7 @@
       <w:tr>
         <w:tc>
           <w:tcPr>
+            <w:tcW w:type="dxa" w:w="709"/>
             <w:gridSpan w:val="1"/>
             <w:vMerge w:val="continue"/>
             <w:tcBorders>
@@ -10808,6 +10849,7 @@
         </w:tc>
         <w:tc>
           <w:tcPr>
+            <w:tcW w:type="dxa" w:w="1276"/>
             <w:gridSpan w:val="1"/>
             <w:vMerge w:val="continue"/>
             <w:tcBorders>
@@ -11317,6 +11359,7 @@
       <w:tr>
         <w:tc>
           <w:tcPr>
+            <w:tcW w:type="dxa" w:w="709"/>
             <w:gridSpan w:val="1"/>
             <w:vMerge w:val="continue"/>
             <w:tcBorders>
@@ -11330,6 +11373,7 @@
         </w:tc>
         <w:tc>
           <w:tcPr>
+            <w:tcW w:type="dxa" w:w="1276"/>
             <w:gridSpan w:val="1"/>
             <w:vMerge w:val="continue"/>
             <w:tcBorders>
@@ -11839,6 +11883,7 @@
       <w:tr>
         <w:tc>
           <w:tcPr>
+            <w:tcW w:type="dxa" w:w="709"/>
             <w:gridSpan w:val="1"/>
             <w:vMerge w:val="continue"/>
             <w:tcBorders>
@@ -11852,6 +11897,7 @@
         </w:tc>
         <w:tc>
           <w:tcPr>
+            <w:tcW w:type="dxa" w:w="1276"/>
             <w:gridSpan w:val="1"/>
             <w:vMerge w:val="continue"/>
             <w:tcBorders>
@@ -12361,6 +12407,7 @@
       <w:tr>
         <w:tc>
           <w:tcPr>
+            <w:tcW w:type="dxa" w:w="709"/>
             <w:gridSpan w:val="1"/>
             <w:vMerge w:val="continue"/>
             <w:tcBorders>
@@ -12374,6 +12421,7 @@
         </w:tc>
         <w:tc>
           <w:tcPr>
+            <w:tcW w:type="dxa" w:w="1276"/>
             <w:gridSpan w:val="1"/>
             <w:vMerge w:val="continue"/>
             <w:tcBorders>
@@ -12883,6 +12931,7 @@
       <w:tr>
         <w:tc>
           <w:tcPr>
+            <w:tcW w:type="dxa" w:w="709"/>
             <w:gridSpan w:val="1"/>
             <w:vMerge w:val="continue"/>
             <w:tcBorders>
@@ -12896,6 +12945,7 @@
         </w:tc>
         <w:tc>
           <w:tcPr>
+            <w:tcW w:type="dxa" w:w="1276"/>
             <w:gridSpan w:val="1"/>
             <w:vMerge w:val="continue"/>
             <w:tcBorders>
@@ -13405,6 +13455,7 @@
       <w:tr>
         <w:tc>
           <w:tcPr>
+            <w:tcW w:type="dxa" w:w="709"/>
             <w:gridSpan w:val="1"/>
             <w:vMerge w:val="continue"/>
             <w:tcBorders>
@@ -13418,6 +13469,7 @@
         </w:tc>
         <w:tc>
           <w:tcPr>
+            <w:tcW w:type="dxa" w:w="1276"/>
             <w:gridSpan w:val="1"/>
             <w:vMerge w:val="continue"/>
             <w:tcBorders>
@@ -13927,6 +13979,7 @@
       <w:tr>
         <w:tc>
           <w:tcPr>
+            <w:tcW w:type="dxa" w:w="709"/>
             <w:gridSpan w:val="1"/>
             <w:vMerge w:val="continue"/>
             <w:tcBorders>
@@ -13940,6 +13993,7 @@
         </w:tc>
         <w:tc>
           <w:tcPr>
+            <w:tcW w:type="dxa" w:w="1276"/>
             <w:gridSpan w:val="1"/>
             <w:vMerge w:val="continue"/>
             <w:tcBorders>
@@ -14449,6 +14503,7 @@
       <w:tr>
         <w:tc>
           <w:tcPr>
+            <w:tcW w:type="dxa" w:w="709"/>
             <w:gridSpan w:val="1"/>
             <w:vMerge w:val="continue"/>
             <w:tcBorders>
@@ -14462,6 +14517,7 @@
         </w:tc>
         <w:tc>
           <w:tcPr>
+            <w:tcW w:type="dxa" w:w="1276"/>
             <w:gridSpan w:val="1"/>
             <w:vMerge w:val="continue"/>
             <w:tcBorders>
@@ -14971,6 +15027,7 @@
       <w:tr>
         <w:tc>
           <w:tcPr>
+            <w:tcW w:type="dxa" w:w="709"/>
             <w:gridSpan w:val="1"/>
             <w:vMerge w:val="continue"/>
             <w:tcBorders>
@@ -14984,6 +15041,7 @@
         </w:tc>
         <w:tc>
           <w:tcPr>
+            <w:tcW w:type="dxa" w:w="1276"/>
             <w:gridSpan w:val="1"/>
             <w:vMerge w:val="continue"/>
             <w:tcBorders>
@@ -15493,6 +15551,7 @@
       <w:tr>
         <w:tc>
           <w:tcPr>
+            <w:tcW w:type="dxa" w:w="709"/>
             <w:gridSpan w:val="1"/>
             <w:vMerge w:val="continue"/>
             <w:tcBorders>
@@ -15506,6 +15565,7 @@
         </w:tc>
         <w:tc>
           <w:tcPr>
+            <w:tcW w:type="dxa" w:w="1276"/>
             <w:gridSpan w:val="1"/>
             <w:vMerge w:val="continue"/>
             <w:tcBorders>
@@ -16015,6 +16075,7 @@
       <w:tr>
         <w:tc>
           <w:tcPr>
+            <w:tcW w:type="dxa" w:w="709"/>
             <w:gridSpan w:val="1"/>
             <w:vMerge w:val="continue"/>
             <w:tcBorders>
@@ -16028,6 +16089,7 @@
         </w:tc>
         <w:tc>
           <w:tcPr>
+            <w:tcW w:type="dxa" w:w="1276"/>
             <w:gridSpan w:val="1"/>
             <w:vMerge w:val="continue"/>
             <w:tcBorders>
@@ -16537,6 +16599,7 @@
       <w:tr>
         <w:tc>
           <w:tcPr>
+            <w:tcW w:type="dxa" w:w="709"/>
             <w:gridSpan w:val="1"/>
             <w:vMerge w:val="continue"/>
             <w:tcBorders>
@@ -16550,6 +16613,7 @@
         </w:tc>
         <w:tc>
           <w:tcPr>
+            <w:tcW w:type="dxa" w:w="1276"/>
             <w:gridSpan w:val="1"/>
             <w:vMerge w:val="continue"/>
             <w:tcBorders>
@@ -17059,6 +17123,7 @@
       <w:tr>
         <w:tc>
           <w:tcPr>
+            <w:tcW w:type="dxa" w:w="709"/>
             <w:gridSpan w:val="1"/>
             <w:vMerge w:val="continue"/>
             <w:tcBorders>
@@ -17072,6 +17137,7 @@
         </w:tc>
         <w:tc>
           <w:tcPr>
+            <w:tcW w:type="dxa" w:w="1276"/>
             <w:gridSpan w:val="1"/>
             <w:vMerge w:val="continue"/>
             <w:tcBorders>
@@ -17581,6 +17647,7 @@
       <w:tr>
         <w:tc>
           <w:tcPr>
+            <w:tcW w:type="dxa" w:w="709"/>
             <w:gridSpan w:val="1"/>
             <w:vMerge w:val="continue"/>
             <w:tcBorders>
@@ -17594,6 +17661,7 @@
         </w:tc>
         <w:tc>
           <w:tcPr>
+            <w:tcW w:type="dxa" w:w="1276"/>
             <w:gridSpan w:val="1"/>
             <w:vMerge w:val="continue"/>
             <w:tcBorders>
@@ -18091,6 +18159,21 @@
   <w:style w:type="paragraph" w:styleId="Normal" w:default="1">
     <w:name w:val="Normal"/>
     <w:qFormat/>
+  </w:style>
+  <w:style w:type="table" w:styleId="TableNormal" w:default="true">
+    <w:name w:val="Normal Table"/>
+    <w:uiPriority w:val="99"/>
+    <w:semiHidden/>
+    <w:unhideWhenUsed/>
+    <w:tblPr>
+      <w:tblInd w:type="dxa" w:w="0"/>
+      <w:tblCellMar>
+        <w:top w:type="dxa" w:w="0"/>
+        <w:left w:type="dxa" w:w="108"/>
+        <w:bottom w:type="dxa" w:w="0"/>
+        <w:right w:type="dxa" w:w="108"/>
+      </w:tblCellMar>
+    </w:tblPr>
   </w:style>
   <w:style w:type="paragraph" w:styleId="Title">
     <w:name w:val="Title"/>

</xml_diff>

<commit_message>
📄 Actualizar registro Word [20-10-2026 00:38]
</commit_message>
<xml_diff>
--- a/registro_2026.docx
+++ b/registro_2026.docx
@@ -356,8 +356,20 @@
               <w:bottom w:val="single" w:color="000000" w:sz="4"/>
               <w:right w:val="single" w:color="000000" w:sz="4"/>
             </w:tcBorders>
-          </w:tcPr>
-          <w:p/>
+            <w:shd w:fill="D9D9D9" w:val="clear"/>
+            <w:tcMar>
+              <w:top w:type="dxa" w:w="60"/>
+              <w:left w:type="dxa" w:w="80"/>
+              <w:bottom w:type="dxa" w:w="60"/>
+              <w:right w:type="dxa" w:w="80"/>
+            </w:tcMar>
+            <w:vAlign w:val="center"/>
+          </w:tcPr>
+          <w:p>
+            <w:pPr>
+              <w:jc w:val="center"/>
+            </w:pPr>
+          </w:p>
         </w:tc>
         <w:tc>
           <w:tcPr>
@@ -370,8 +382,20 @@
               <w:bottom w:val="single" w:color="000000" w:sz="4"/>
               <w:right w:val="single" w:color="000000" w:sz="4"/>
             </w:tcBorders>
-          </w:tcPr>
-          <w:p/>
+            <w:shd w:fill="D9D9D9" w:val="clear"/>
+            <w:tcMar>
+              <w:top w:type="dxa" w:w="60"/>
+              <w:left w:type="dxa" w:w="80"/>
+              <w:bottom w:type="dxa" w:w="60"/>
+              <w:right w:type="dxa" w:w="80"/>
+            </w:tcMar>
+            <w:vAlign w:val="center"/>
+          </w:tcPr>
+          <w:p>
+            <w:pPr>
+              <w:jc w:val="center"/>
+            </w:pPr>
+          </w:p>
         </w:tc>
         <w:tc>
           <w:tcPr>
@@ -888,8 +912,19 @@
               <w:bottom w:val="single" w:color="000000" w:sz="4"/>
               <w:right w:val="single" w:color="000000" w:sz="4"/>
             </w:tcBorders>
-          </w:tcPr>
-          <w:p/>
+            <w:tcMar>
+              <w:top w:type="dxa" w:w="60"/>
+              <w:left w:type="dxa" w:w="80"/>
+              <w:bottom w:type="dxa" w:w="60"/>
+              <w:right w:type="dxa" w:w="80"/>
+            </w:tcMar>
+            <w:vAlign w:val="center"/>
+          </w:tcPr>
+          <w:p>
+            <w:pPr>
+              <w:jc w:val="center"/>
+            </w:pPr>
+          </w:p>
         </w:tc>
         <w:tc>
           <w:tcPr>
@@ -902,8 +937,19 @@
               <w:bottom w:val="single" w:color="000000" w:sz="4"/>
               <w:right w:val="single" w:color="000000" w:sz="4"/>
             </w:tcBorders>
-          </w:tcPr>
-          <w:p/>
+            <w:tcMar>
+              <w:top w:type="dxa" w:w="60"/>
+              <w:left w:type="dxa" w:w="80"/>
+              <w:bottom w:type="dxa" w:w="60"/>
+              <w:right w:type="dxa" w:w="80"/>
+            </w:tcMar>
+            <w:vAlign w:val="center"/>
+          </w:tcPr>
+          <w:p>
+            <w:pPr>
+              <w:jc w:val="center"/>
+            </w:pPr>
+          </w:p>
         </w:tc>
         <w:tc>
           <w:tcPr>
@@ -1412,8 +1458,19 @@
               <w:bottom w:val="single" w:color="000000" w:sz="4"/>
               <w:right w:val="single" w:color="000000" w:sz="4"/>
             </w:tcBorders>
-          </w:tcPr>
-          <w:p/>
+            <w:tcMar>
+              <w:top w:type="dxa" w:w="60"/>
+              <w:left w:type="dxa" w:w="80"/>
+              <w:bottom w:type="dxa" w:w="60"/>
+              <w:right w:type="dxa" w:w="80"/>
+            </w:tcMar>
+            <w:vAlign w:val="center"/>
+          </w:tcPr>
+          <w:p>
+            <w:pPr>
+              <w:jc w:val="center"/>
+            </w:pPr>
+          </w:p>
         </w:tc>
         <w:tc>
           <w:tcPr>
@@ -1426,8 +1483,19 @@
               <w:bottom w:val="single" w:color="000000" w:sz="4"/>
               <w:right w:val="single" w:color="000000" w:sz="4"/>
             </w:tcBorders>
-          </w:tcPr>
-          <w:p/>
+            <w:tcMar>
+              <w:top w:type="dxa" w:w="60"/>
+              <w:left w:type="dxa" w:w="80"/>
+              <w:bottom w:type="dxa" w:w="60"/>
+              <w:right w:type="dxa" w:w="80"/>
+            </w:tcMar>
+            <w:vAlign w:val="center"/>
+          </w:tcPr>
+          <w:p>
+            <w:pPr>
+              <w:jc w:val="center"/>
+            </w:pPr>
+          </w:p>
         </w:tc>
         <w:tc>
           <w:tcPr>
@@ -1936,8 +2004,19 @@
               <w:bottom w:val="single" w:color="000000" w:sz="4"/>
               <w:right w:val="single" w:color="000000" w:sz="4"/>
             </w:tcBorders>
-          </w:tcPr>
-          <w:p/>
+            <w:tcMar>
+              <w:top w:type="dxa" w:w="60"/>
+              <w:left w:type="dxa" w:w="80"/>
+              <w:bottom w:type="dxa" w:w="60"/>
+              <w:right w:type="dxa" w:w="80"/>
+            </w:tcMar>
+            <w:vAlign w:val="center"/>
+          </w:tcPr>
+          <w:p>
+            <w:pPr>
+              <w:jc w:val="center"/>
+            </w:pPr>
+          </w:p>
         </w:tc>
         <w:tc>
           <w:tcPr>
@@ -1950,8 +2029,19 @@
               <w:bottom w:val="single" w:color="000000" w:sz="4"/>
               <w:right w:val="single" w:color="000000" w:sz="4"/>
             </w:tcBorders>
-          </w:tcPr>
-          <w:p/>
+            <w:tcMar>
+              <w:top w:type="dxa" w:w="60"/>
+              <w:left w:type="dxa" w:w="80"/>
+              <w:bottom w:type="dxa" w:w="60"/>
+              <w:right w:type="dxa" w:w="80"/>
+            </w:tcMar>
+            <w:vAlign w:val="center"/>
+          </w:tcPr>
+          <w:p>
+            <w:pPr>
+              <w:jc w:val="center"/>
+            </w:pPr>
+          </w:p>
         </w:tc>
         <w:tc>
           <w:tcPr>
@@ -2460,8 +2550,19 @@
               <w:bottom w:val="single" w:color="000000" w:sz="4"/>
               <w:right w:val="single" w:color="000000" w:sz="4"/>
             </w:tcBorders>
-          </w:tcPr>
-          <w:p/>
+            <w:tcMar>
+              <w:top w:type="dxa" w:w="60"/>
+              <w:left w:type="dxa" w:w="80"/>
+              <w:bottom w:type="dxa" w:w="60"/>
+              <w:right w:type="dxa" w:w="80"/>
+            </w:tcMar>
+            <w:vAlign w:val="center"/>
+          </w:tcPr>
+          <w:p>
+            <w:pPr>
+              <w:jc w:val="center"/>
+            </w:pPr>
+          </w:p>
         </w:tc>
         <w:tc>
           <w:tcPr>
@@ -2474,8 +2575,19 @@
               <w:bottom w:val="single" w:color="000000" w:sz="4"/>
               <w:right w:val="single" w:color="000000" w:sz="4"/>
             </w:tcBorders>
-          </w:tcPr>
-          <w:p/>
+            <w:tcMar>
+              <w:top w:type="dxa" w:w="60"/>
+              <w:left w:type="dxa" w:w="80"/>
+              <w:bottom w:type="dxa" w:w="60"/>
+              <w:right w:type="dxa" w:w="80"/>
+            </w:tcMar>
+            <w:vAlign w:val="center"/>
+          </w:tcPr>
+          <w:p>
+            <w:pPr>
+              <w:jc w:val="center"/>
+            </w:pPr>
+          </w:p>
         </w:tc>
         <w:tc>
           <w:tcPr>
@@ -2984,8 +3096,19 @@
               <w:bottom w:val="single" w:color="000000" w:sz="4"/>
               <w:right w:val="single" w:color="000000" w:sz="4"/>
             </w:tcBorders>
-          </w:tcPr>
-          <w:p/>
+            <w:tcMar>
+              <w:top w:type="dxa" w:w="60"/>
+              <w:left w:type="dxa" w:w="80"/>
+              <w:bottom w:type="dxa" w:w="60"/>
+              <w:right w:type="dxa" w:w="80"/>
+            </w:tcMar>
+            <w:vAlign w:val="center"/>
+          </w:tcPr>
+          <w:p>
+            <w:pPr>
+              <w:jc w:val="center"/>
+            </w:pPr>
+          </w:p>
         </w:tc>
         <w:tc>
           <w:tcPr>
@@ -2998,8 +3121,19 @@
               <w:bottom w:val="single" w:color="000000" w:sz="4"/>
               <w:right w:val="single" w:color="000000" w:sz="4"/>
             </w:tcBorders>
-          </w:tcPr>
-          <w:p/>
+            <w:tcMar>
+              <w:top w:type="dxa" w:w="60"/>
+              <w:left w:type="dxa" w:w="80"/>
+              <w:bottom w:type="dxa" w:w="60"/>
+              <w:right w:type="dxa" w:w="80"/>
+            </w:tcMar>
+            <w:vAlign w:val="center"/>
+          </w:tcPr>
+          <w:p>
+            <w:pPr>
+              <w:jc w:val="center"/>
+            </w:pPr>
+          </w:p>
         </w:tc>
         <w:tc>
           <w:tcPr>
@@ -3508,8 +3642,19 @@
               <w:bottom w:val="single" w:color="000000" w:sz="4"/>
               <w:right w:val="single" w:color="000000" w:sz="4"/>
             </w:tcBorders>
-          </w:tcPr>
-          <w:p/>
+            <w:tcMar>
+              <w:top w:type="dxa" w:w="60"/>
+              <w:left w:type="dxa" w:w="80"/>
+              <w:bottom w:type="dxa" w:w="60"/>
+              <w:right w:type="dxa" w:w="80"/>
+            </w:tcMar>
+            <w:vAlign w:val="center"/>
+          </w:tcPr>
+          <w:p>
+            <w:pPr>
+              <w:jc w:val="center"/>
+            </w:pPr>
+          </w:p>
         </w:tc>
         <w:tc>
           <w:tcPr>
@@ -3522,8 +3667,19 @@
               <w:bottom w:val="single" w:color="000000" w:sz="4"/>
               <w:right w:val="single" w:color="000000" w:sz="4"/>
             </w:tcBorders>
-          </w:tcPr>
-          <w:p/>
+            <w:tcMar>
+              <w:top w:type="dxa" w:w="60"/>
+              <w:left w:type="dxa" w:w="80"/>
+              <w:bottom w:type="dxa" w:w="60"/>
+              <w:right w:type="dxa" w:w="80"/>
+            </w:tcMar>
+            <w:vAlign w:val="center"/>
+          </w:tcPr>
+          <w:p>
+            <w:pPr>
+              <w:jc w:val="center"/>
+            </w:pPr>
+          </w:p>
         </w:tc>
         <w:tc>
           <w:tcPr>
@@ -4032,8 +4188,19 @@
               <w:bottom w:val="single" w:color="000000" w:sz="4"/>
               <w:right w:val="single" w:color="000000" w:sz="4"/>
             </w:tcBorders>
-          </w:tcPr>
-          <w:p/>
+            <w:tcMar>
+              <w:top w:type="dxa" w:w="60"/>
+              <w:left w:type="dxa" w:w="80"/>
+              <w:bottom w:type="dxa" w:w="60"/>
+              <w:right w:type="dxa" w:w="80"/>
+            </w:tcMar>
+            <w:vAlign w:val="center"/>
+          </w:tcPr>
+          <w:p>
+            <w:pPr>
+              <w:jc w:val="center"/>
+            </w:pPr>
+          </w:p>
         </w:tc>
         <w:tc>
           <w:tcPr>
@@ -4046,8 +4213,19 @@
               <w:bottom w:val="single" w:color="000000" w:sz="4"/>
               <w:right w:val="single" w:color="000000" w:sz="4"/>
             </w:tcBorders>
-          </w:tcPr>
-          <w:p/>
+            <w:tcMar>
+              <w:top w:type="dxa" w:w="60"/>
+              <w:left w:type="dxa" w:w="80"/>
+              <w:bottom w:type="dxa" w:w="60"/>
+              <w:right w:type="dxa" w:w="80"/>
+            </w:tcMar>
+            <w:vAlign w:val="center"/>
+          </w:tcPr>
+          <w:p>
+            <w:pPr>
+              <w:jc w:val="center"/>
+            </w:pPr>
+          </w:p>
         </w:tc>
         <w:tc>
           <w:tcPr>
@@ -4556,8 +4734,19 @@
               <w:bottom w:val="single" w:color="000000" w:sz="4"/>
               <w:right w:val="single" w:color="000000" w:sz="4"/>
             </w:tcBorders>
-          </w:tcPr>
-          <w:p/>
+            <w:tcMar>
+              <w:top w:type="dxa" w:w="60"/>
+              <w:left w:type="dxa" w:w="80"/>
+              <w:bottom w:type="dxa" w:w="60"/>
+              <w:right w:type="dxa" w:w="80"/>
+            </w:tcMar>
+            <w:vAlign w:val="center"/>
+          </w:tcPr>
+          <w:p>
+            <w:pPr>
+              <w:jc w:val="center"/>
+            </w:pPr>
+          </w:p>
         </w:tc>
         <w:tc>
           <w:tcPr>
@@ -4570,8 +4759,19 @@
               <w:bottom w:val="single" w:color="000000" w:sz="4"/>
               <w:right w:val="single" w:color="000000" w:sz="4"/>
             </w:tcBorders>
-          </w:tcPr>
-          <w:p/>
+            <w:tcMar>
+              <w:top w:type="dxa" w:w="60"/>
+              <w:left w:type="dxa" w:w="80"/>
+              <w:bottom w:type="dxa" w:w="60"/>
+              <w:right w:type="dxa" w:w="80"/>
+            </w:tcMar>
+            <w:vAlign w:val="center"/>
+          </w:tcPr>
+          <w:p>
+            <w:pPr>
+              <w:jc w:val="center"/>
+            </w:pPr>
+          </w:p>
         </w:tc>
         <w:tc>
           <w:tcPr>
@@ -5080,8 +5280,19 @@
               <w:bottom w:val="single" w:color="000000" w:sz="4"/>
               <w:right w:val="single" w:color="000000" w:sz="4"/>
             </w:tcBorders>
-          </w:tcPr>
-          <w:p/>
+            <w:tcMar>
+              <w:top w:type="dxa" w:w="60"/>
+              <w:left w:type="dxa" w:w="80"/>
+              <w:bottom w:type="dxa" w:w="60"/>
+              <w:right w:type="dxa" w:w="80"/>
+            </w:tcMar>
+            <w:vAlign w:val="center"/>
+          </w:tcPr>
+          <w:p>
+            <w:pPr>
+              <w:jc w:val="center"/>
+            </w:pPr>
+          </w:p>
         </w:tc>
         <w:tc>
           <w:tcPr>
@@ -5094,8 +5305,19 @@
               <w:bottom w:val="single" w:color="000000" w:sz="4"/>
               <w:right w:val="single" w:color="000000" w:sz="4"/>
             </w:tcBorders>
-          </w:tcPr>
-          <w:p/>
+            <w:tcMar>
+              <w:top w:type="dxa" w:w="60"/>
+              <w:left w:type="dxa" w:w="80"/>
+              <w:bottom w:type="dxa" w:w="60"/>
+              <w:right w:type="dxa" w:w="80"/>
+            </w:tcMar>
+            <w:vAlign w:val="center"/>
+          </w:tcPr>
+          <w:p>
+            <w:pPr>
+              <w:jc w:val="center"/>
+            </w:pPr>
+          </w:p>
         </w:tc>
         <w:tc>
           <w:tcPr>
@@ -5604,8 +5826,19 @@
               <w:bottom w:val="single" w:color="000000" w:sz="4"/>
               <w:right w:val="single" w:color="000000" w:sz="4"/>
             </w:tcBorders>
-          </w:tcPr>
-          <w:p/>
+            <w:tcMar>
+              <w:top w:type="dxa" w:w="60"/>
+              <w:left w:type="dxa" w:w="80"/>
+              <w:bottom w:type="dxa" w:w="60"/>
+              <w:right w:type="dxa" w:w="80"/>
+            </w:tcMar>
+            <w:vAlign w:val="center"/>
+          </w:tcPr>
+          <w:p>
+            <w:pPr>
+              <w:jc w:val="center"/>
+            </w:pPr>
+          </w:p>
         </w:tc>
         <w:tc>
           <w:tcPr>
@@ -5618,8 +5851,19 @@
               <w:bottom w:val="single" w:color="000000" w:sz="4"/>
               <w:right w:val="single" w:color="000000" w:sz="4"/>
             </w:tcBorders>
-          </w:tcPr>
-          <w:p/>
+            <w:tcMar>
+              <w:top w:type="dxa" w:w="60"/>
+              <w:left w:type="dxa" w:w="80"/>
+              <w:bottom w:type="dxa" w:w="60"/>
+              <w:right w:type="dxa" w:w="80"/>
+            </w:tcMar>
+            <w:vAlign w:val="center"/>
+          </w:tcPr>
+          <w:p>
+            <w:pPr>
+              <w:jc w:val="center"/>
+            </w:pPr>
+          </w:p>
         </w:tc>
         <w:tc>
           <w:tcPr>
@@ -6128,8 +6372,19 @@
               <w:bottom w:val="single" w:color="000000" w:sz="4"/>
               <w:right w:val="single" w:color="000000" w:sz="4"/>
             </w:tcBorders>
-          </w:tcPr>
-          <w:p/>
+            <w:tcMar>
+              <w:top w:type="dxa" w:w="60"/>
+              <w:left w:type="dxa" w:w="80"/>
+              <w:bottom w:type="dxa" w:w="60"/>
+              <w:right w:type="dxa" w:w="80"/>
+            </w:tcMar>
+            <w:vAlign w:val="center"/>
+          </w:tcPr>
+          <w:p>
+            <w:pPr>
+              <w:jc w:val="center"/>
+            </w:pPr>
+          </w:p>
         </w:tc>
         <w:tc>
           <w:tcPr>
@@ -6142,8 +6397,19 @@
               <w:bottom w:val="single" w:color="000000" w:sz="4"/>
               <w:right w:val="single" w:color="000000" w:sz="4"/>
             </w:tcBorders>
-          </w:tcPr>
-          <w:p/>
+            <w:tcMar>
+              <w:top w:type="dxa" w:w="60"/>
+              <w:left w:type="dxa" w:w="80"/>
+              <w:bottom w:type="dxa" w:w="60"/>
+              <w:right w:type="dxa" w:w="80"/>
+            </w:tcMar>
+            <w:vAlign w:val="center"/>
+          </w:tcPr>
+          <w:p>
+            <w:pPr>
+              <w:jc w:val="center"/>
+            </w:pPr>
+          </w:p>
         </w:tc>
         <w:tc>
           <w:tcPr>
@@ -6652,8 +6918,19 @@
               <w:bottom w:val="single" w:color="000000" w:sz="4"/>
               <w:right w:val="single" w:color="000000" w:sz="4"/>
             </w:tcBorders>
-          </w:tcPr>
-          <w:p/>
+            <w:tcMar>
+              <w:top w:type="dxa" w:w="60"/>
+              <w:left w:type="dxa" w:w="80"/>
+              <w:bottom w:type="dxa" w:w="60"/>
+              <w:right w:type="dxa" w:w="80"/>
+            </w:tcMar>
+            <w:vAlign w:val="center"/>
+          </w:tcPr>
+          <w:p>
+            <w:pPr>
+              <w:jc w:val="center"/>
+            </w:pPr>
+          </w:p>
         </w:tc>
         <w:tc>
           <w:tcPr>
@@ -6666,8 +6943,19 @@
               <w:bottom w:val="single" w:color="000000" w:sz="4"/>
               <w:right w:val="single" w:color="000000" w:sz="4"/>
             </w:tcBorders>
-          </w:tcPr>
-          <w:p/>
+            <w:tcMar>
+              <w:top w:type="dxa" w:w="60"/>
+              <w:left w:type="dxa" w:w="80"/>
+              <w:bottom w:type="dxa" w:w="60"/>
+              <w:right w:type="dxa" w:w="80"/>
+            </w:tcMar>
+            <w:vAlign w:val="center"/>
+          </w:tcPr>
+          <w:p>
+            <w:pPr>
+              <w:jc w:val="center"/>
+            </w:pPr>
+          </w:p>
         </w:tc>
         <w:tc>
           <w:tcPr>
@@ -7176,8 +7464,19 @@
               <w:bottom w:val="single" w:color="000000" w:sz="4"/>
               <w:right w:val="single" w:color="000000" w:sz="4"/>
             </w:tcBorders>
-          </w:tcPr>
-          <w:p/>
+            <w:tcMar>
+              <w:top w:type="dxa" w:w="60"/>
+              <w:left w:type="dxa" w:w="80"/>
+              <w:bottom w:type="dxa" w:w="60"/>
+              <w:right w:type="dxa" w:w="80"/>
+            </w:tcMar>
+            <w:vAlign w:val="center"/>
+          </w:tcPr>
+          <w:p>
+            <w:pPr>
+              <w:jc w:val="center"/>
+            </w:pPr>
+          </w:p>
         </w:tc>
         <w:tc>
           <w:tcPr>
@@ -7190,8 +7489,19 @@
               <w:bottom w:val="single" w:color="000000" w:sz="4"/>
               <w:right w:val="single" w:color="000000" w:sz="4"/>
             </w:tcBorders>
-          </w:tcPr>
-          <w:p/>
+            <w:tcMar>
+              <w:top w:type="dxa" w:w="60"/>
+              <w:left w:type="dxa" w:w="80"/>
+              <w:bottom w:type="dxa" w:w="60"/>
+              <w:right w:type="dxa" w:w="80"/>
+            </w:tcMar>
+            <w:vAlign w:val="center"/>
+          </w:tcPr>
+          <w:p>
+            <w:pPr>
+              <w:jc w:val="center"/>
+            </w:pPr>
+          </w:p>
         </w:tc>
         <w:tc>
           <w:tcPr>
@@ -7700,8 +8010,19 @@
               <w:bottom w:val="single" w:color="000000" w:sz="4"/>
               <w:right w:val="single" w:color="000000" w:sz="4"/>
             </w:tcBorders>
-          </w:tcPr>
-          <w:p/>
+            <w:tcMar>
+              <w:top w:type="dxa" w:w="60"/>
+              <w:left w:type="dxa" w:w="80"/>
+              <w:bottom w:type="dxa" w:w="60"/>
+              <w:right w:type="dxa" w:w="80"/>
+            </w:tcMar>
+            <w:vAlign w:val="center"/>
+          </w:tcPr>
+          <w:p>
+            <w:pPr>
+              <w:jc w:val="center"/>
+            </w:pPr>
+          </w:p>
         </w:tc>
         <w:tc>
           <w:tcPr>
@@ -7714,8 +8035,19 @@
               <w:bottom w:val="single" w:color="000000" w:sz="4"/>
               <w:right w:val="single" w:color="000000" w:sz="4"/>
             </w:tcBorders>
-          </w:tcPr>
-          <w:p/>
+            <w:tcMar>
+              <w:top w:type="dxa" w:w="60"/>
+              <w:left w:type="dxa" w:w="80"/>
+              <w:bottom w:type="dxa" w:w="60"/>
+              <w:right w:type="dxa" w:w="80"/>
+            </w:tcMar>
+            <w:vAlign w:val="center"/>
+          </w:tcPr>
+          <w:p>
+            <w:pPr>
+              <w:jc w:val="center"/>
+            </w:pPr>
+          </w:p>
         </w:tc>
         <w:tc>
           <w:tcPr>
@@ -8224,8 +8556,19 @@
               <w:bottom w:val="single" w:color="000000" w:sz="4"/>
               <w:right w:val="single" w:color="000000" w:sz="4"/>
             </w:tcBorders>
-          </w:tcPr>
-          <w:p/>
+            <w:tcMar>
+              <w:top w:type="dxa" w:w="60"/>
+              <w:left w:type="dxa" w:w="80"/>
+              <w:bottom w:type="dxa" w:w="60"/>
+              <w:right w:type="dxa" w:w="80"/>
+            </w:tcMar>
+            <w:vAlign w:val="center"/>
+          </w:tcPr>
+          <w:p>
+            <w:pPr>
+              <w:jc w:val="center"/>
+            </w:pPr>
+          </w:p>
         </w:tc>
         <w:tc>
           <w:tcPr>
@@ -8238,8 +8581,19 @@
               <w:bottom w:val="single" w:color="000000" w:sz="4"/>
               <w:right w:val="single" w:color="000000" w:sz="4"/>
             </w:tcBorders>
-          </w:tcPr>
-          <w:p/>
+            <w:tcMar>
+              <w:top w:type="dxa" w:w="60"/>
+              <w:left w:type="dxa" w:w="80"/>
+              <w:bottom w:type="dxa" w:w="60"/>
+              <w:right w:type="dxa" w:w="80"/>
+            </w:tcMar>
+            <w:vAlign w:val="center"/>
+          </w:tcPr>
+          <w:p>
+            <w:pPr>
+              <w:jc w:val="center"/>
+            </w:pPr>
+          </w:p>
         </w:tc>
         <w:tc>
           <w:tcPr>
@@ -8748,8 +9102,19 @@
               <w:bottom w:val="single" w:color="000000" w:sz="4"/>
               <w:right w:val="single" w:color="000000" w:sz="4"/>
             </w:tcBorders>
-          </w:tcPr>
-          <w:p/>
+            <w:tcMar>
+              <w:top w:type="dxa" w:w="60"/>
+              <w:left w:type="dxa" w:w="80"/>
+              <w:bottom w:type="dxa" w:w="60"/>
+              <w:right w:type="dxa" w:w="80"/>
+            </w:tcMar>
+            <w:vAlign w:val="center"/>
+          </w:tcPr>
+          <w:p>
+            <w:pPr>
+              <w:jc w:val="center"/>
+            </w:pPr>
+          </w:p>
         </w:tc>
         <w:tc>
           <w:tcPr>
@@ -8762,8 +9127,19 @@
               <w:bottom w:val="single" w:color="000000" w:sz="4"/>
               <w:right w:val="single" w:color="000000" w:sz="4"/>
             </w:tcBorders>
-          </w:tcPr>
-          <w:p/>
+            <w:tcMar>
+              <w:top w:type="dxa" w:w="60"/>
+              <w:left w:type="dxa" w:w="80"/>
+              <w:bottom w:type="dxa" w:w="60"/>
+              <w:right w:type="dxa" w:w="80"/>
+            </w:tcMar>
+            <w:vAlign w:val="center"/>
+          </w:tcPr>
+          <w:p>
+            <w:pPr>
+              <w:jc w:val="center"/>
+            </w:pPr>
+          </w:p>
         </w:tc>
         <w:tc>
           <w:tcPr>
@@ -9272,8 +9648,19 @@
               <w:bottom w:val="single" w:color="000000" w:sz="4"/>
               <w:right w:val="single" w:color="000000" w:sz="4"/>
             </w:tcBorders>
-          </w:tcPr>
-          <w:p/>
+            <w:tcMar>
+              <w:top w:type="dxa" w:w="60"/>
+              <w:left w:type="dxa" w:w="80"/>
+              <w:bottom w:type="dxa" w:w="60"/>
+              <w:right w:type="dxa" w:w="80"/>
+            </w:tcMar>
+            <w:vAlign w:val="center"/>
+          </w:tcPr>
+          <w:p>
+            <w:pPr>
+              <w:jc w:val="center"/>
+            </w:pPr>
+          </w:p>
         </w:tc>
         <w:tc>
           <w:tcPr>
@@ -9286,8 +9673,19 @@
               <w:bottom w:val="single" w:color="000000" w:sz="4"/>
               <w:right w:val="single" w:color="000000" w:sz="4"/>
             </w:tcBorders>
-          </w:tcPr>
-          <w:p/>
+            <w:tcMar>
+              <w:top w:type="dxa" w:w="60"/>
+              <w:left w:type="dxa" w:w="80"/>
+              <w:bottom w:type="dxa" w:w="60"/>
+              <w:right w:type="dxa" w:w="80"/>
+            </w:tcMar>
+            <w:vAlign w:val="center"/>
+          </w:tcPr>
+          <w:p>
+            <w:pPr>
+              <w:jc w:val="center"/>
+            </w:pPr>
+          </w:p>
         </w:tc>
         <w:tc>
           <w:tcPr>
@@ -9796,8 +10194,19 @@
               <w:bottom w:val="single" w:color="000000" w:sz="4"/>
               <w:right w:val="single" w:color="000000" w:sz="4"/>
             </w:tcBorders>
-          </w:tcPr>
-          <w:p/>
+            <w:tcMar>
+              <w:top w:type="dxa" w:w="60"/>
+              <w:left w:type="dxa" w:w="80"/>
+              <w:bottom w:type="dxa" w:w="60"/>
+              <w:right w:type="dxa" w:w="80"/>
+            </w:tcMar>
+            <w:vAlign w:val="center"/>
+          </w:tcPr>
+          <w:p>
+            <w:pPr>
+              <w:jc w:val="center"/>
+            </w:pPr>
+          </w:p>
         </w:tc>
         <w:tc>
           <w:tcPr>
@@ -9810,8 +10219,19 @@
               <w:bottom w:val="single" w:color="000000" w:sz="4"/>
               <w:right w:val="single" w:color="000000" w:sz="4"/>
             </w:tcBorders>
-          </w:tcPr>
-          <w:p/>
+            <w:tcMar>
+              <w:top w:type="dxa" w:w="60"/>
+              <w:left w:type="dxa" w:w="80"/>
+              <w:bottom w:type="dxa" w:w="60"/>
+              <w:right w:type="dxa" w:w="80"/>
+            </w:tcMar>
+            <w:vAlign w:val="center"/>
+          </w:tcPr>
+          <w:p>
+            <w:pPr>
+              <w:jc w:val="center"/>
+            </w:pPr>
+          </w:p>
         </w:tc>
         <w:tc>
           <w:tcPr>
@@ -10320,8 +10740,19 @@
               <w:bottom w:val="single" w:color="000000" w:sz="4"/>
               <w:right w:val="single" w:color="000000" w:sz="4"/>
             </w:tcBorders>
-          </w:tcPr>
-          <w:p/>
+            <w:tcMar>
+              <w:top w:type="dxa" w:w="60"/>
+              <w:left w:type="dxa" w:w="80"/>
+              <w:bottom w:type="dxa" w:w="60"/>
+              <w:right w:type="dxa" w:w="80"/>
+            </w:tcMar>
+            <w:vAlign w:val="center"/>
+          </w:tcPr>
+          <w:p>
+            <w:pPr>
+              <w:jc w:val="center"/>
+            </w:pPr>
+          </w:p>
         </w:tc>
         <w:tc>
           <w:tcPr>
@@ -10334,8 +10765,19 @@
               <w:bottom w:val="single" w:color="000000" w:sz="4"/>
               <w:right w:val="single" w:color="000000" w:sz="4"/>
             </w:tcBorders>
-          </w:tcPr>
-          <w:p/>
+            <w:tcMar>
+              <w:top w:type="dxa" w:w="60"/>
+              <w:left w:type="dxa" w:w="80"/>
+              <w:bottom w:type="dxa" w:w="60"/>
+              <w:right w:type="dxa" w:w="80"/>
+            </w:tcMar>
+            <w:vAlign w:val="center"/>
+          </w:tcPr>
+          <w:p>
+            <w:pPr>
+              <w:jc w:val="center"/>
+            </w:pPr>
+          </w:p>
         </w:tc>
         <w:tc>
           <w:tcPr>
@@ -10844,8 +11286,19 @@
               <w:bottom w:val="single" w:color="000000" w:sz="4"/>
               <w:right w:val="single" w:color="000000" w:sz="4"/>
             </w:tcBorders>
-          </w:tcPr>
-          <w:p/>
+            <w:tcMar>
+              <w:top w:type="dxa" w:w="60"/>
+              <w:left w:type="dxa" w:w="80"/>
+              <w:bottom w:type="dxa" w:w="60"/>
+              <w:right w:type="dxa" w:w="80"/>
+            </w:tcMar>
+            <w:vAlign w:val="center"/>
+          </w:tcPr>
+          <w:p>
+            <w:pPr>
+              <w:jc w:val="center"/>
+            </w:pPr>
+          </w:p>
         </w:tc>
         <w:tc>
           <w:tcPr>
@@ -10858,8 +11311,19 @@
               <w:bottom w:val="single" w:color="000000" w:sz="4"/>
               <w:right w:val="single" w:color="000000" w:sz="4"/>
             </w:tcBorders>
-          </w:tcPr>
-          <w:p/>
+            <w:tcMar>
+              <w:top w:type="dxa" w:w="60"/>
+              <w:left w:type="dxa" w:w="80"/>
+              <w:bottom w:type="dxa" w:w="60"/>
+              <w:right w:type="dxa" w:w="80"/>
+            </w:tcMar>
+            <w:vAlign w:val="center"/>
+          </w:tcPr>
+          <w:p>
+            <w:pPr>
+              <w:jc w:val="center"/>
+            </w:pPr>
+          </w:p>
         </w:tc>
         <w:tc>
           <w:tcPr>
@@ -11368,8 +11832,19 @@
               <w:bottom w:val="single" w:color="000000" w:sz="4"/>
               <w:right w:val="single" w:color="000000" w:sz="4"/>
             </w:tcBorders>
-          </w:tcPr>
-          <w:p/>
+            <w:tcMar>
+              <w:top w:type="dxa" w:w="60"/>
+              <w:left w:type="dxa" w:w="80"/>
+              <w:bottom w:type="dxa" w:w="60"/>
+              <w:right w:type="dxa" w:w="80"/>
+            </w:tcMar>
+            <w:vAlign w:val="center"/>
+          </w:tcPr>
+          <w:p>
+            <w:pPr>
+              <w:jc w:val="center"/>
+            </w:pPr>
+          </w:p>
         </w:tc>
         <w:tc>
           <w:tcPr>
@@ -11382,8 +11857,19 @@
               <w:bottom w:val="single" w:color="000000" w:sz="4"/>
               <w:right w:val="single" w:color="000000" w:sz="4"/>
             </w:tcBorders>
-          </w:tcPr>
-          <w:p/>
+            <w:tcMar>
+              <w:top w:type="dxa" w:w="60"/>
+              <w:left w:type="dxa" w:w="80"/>
+              <w:bottom w:type="dxa" w:w="60"/>
+              <w:right w:type="dxa" w:w="80"/>
+            </w:tcMar>
+            <w:vAlign w:val="center"/>
+          </w:tcPr>
+          <w:p>
+            <w:pPr>
+              <w:jc w:val="center"/>
+            </w:pPr>
+          </w:p>
         </w:tc>
         <w:tc>
           <w:tcPr>
@@ -11892,8 +12378,19 @@
               <w:bottom w:val="single" w:color="000000" w:sz="4"/>
               <w:right w:val="single" w:color="000000" w:sz="4"/>
             </w:tcBorders>
-          </w:tcPr>
-          <w:p/>
+            <w:tcMar>
+              <w:top w:type="dxa" w:w="60"/>
+              <w:left w:type="dxa" w:w="80"/>
+              <w:bottom w:type="dxa" w:w="60"/>
+              <w:right w:type="dxa" w:w="80"/>
+            </w:tcMar>
+            <w:vAlign w:val="center"/>
+          </w:tcPr>
+          <w:p>
+            <w:pPr>
+              <w:jc w:val="center"/>
+            </w:pPr>
+          </w:p>
         </w:tc>
         <w:tc>
           <w:tcPr>
@@ -11906,8 +12403,19 @@
               <w:bottom w:val="single" w:color="000000" w:sz="4"/>
               <w:right w:val="single" w:color="000000" w:sz="4"/>
             </w:tcBorders>
-          </w:tcPr>
-          <w:p/>
+            <w:tcMar>
+              <w:top w:type="dxa" w:w="60"/>
+              <w:left w:type="dxa" w:w="80"/>
+              <w:bottom w:type="dxa" w:w="60"/>
+              <w:right w:type="dxa" w:w="80"/>
+            </w:tcMar>
+            <w:vAlign w:val="center"/>
+          </w:tcPr>
+          <w:p>
+            <w:pPr>
+              <w:jc w:val="center"/>
+            </w:pPr>
+          </w:p>
         </w:tc>
         <w:tc>
           <w:tcPr>
@@ -12416,8 +12924,19 @@
               <w:bottom w:val="single" w:color="000000" w:sz="4"/>
               <w:right w:val="single" w:color="000000" w:sz="4"/>
             </w:tcBorders>
-          </w:tcPr>
-          <w:p/>
+            <w:tcMar>
+              <w:top w:type="dxa" w:w="60"/>
+              <w:left w:type="dxa" w:w="80"/>
+              <w:bottom w:type="dxa" w:w="60"/>
+              <w:right w:type="dxa" w:w="80"/>
+            </w:tcMar>
+            <w:vAlign w:val="center"/>
+          </w:tcPr>
+          <w:p>
+            <w:pPr>
+              <w:jc w:val="center"/>
+            </w:pPr>
+          </w:p>
         </w:tc>
         <w:tc>
           <w:tcPr>
@@ -12430,8 +12949,19 @@
               <w:bottom w:val="single" w:color="000000" w:sz="4"/>
               <w:right w:val="single" w:color="000000" w:sz="4"/>
             </w:tcBorders>
-          </w:tcPr>
-          <w:p/>
+            <w:tcMar>
+              <w:top w:type="dxa" w:w="60"/>
+              <w:left w:type="dxa" w:w="80"/>
+              <w:bottom w:type="dxa" w:w="60"/>
+              <w:right w:type="dxa" w:w="80"/>
+            </w:tcMar>
+            <w:vAlign w:val="center"/>
+          </w:tcPr>
+          <w:p>
+            <w:pPr>
+              <w:jc w:val="center"/>
+            </w:pPr>
+          </w:p>
         </w:tc>
         <w:tc>
           <w:tcPr>
@@ -12940,8 +13470,19 @@
               <w:bottom w:val="single" w:color="000000" w:sz="4"/>
               <w:right w:val="single" w:color="000000" w:sz="4"/>
             </w:tcBorders>
-          </w:tcPr>
-          <w:p/>
+            <w:tcMar>
+              <w:top w:type="dxa" w:w="60"/>
+              <w:left w:type="dxa" w:w="80"/>
+              <w:bottom w:type="dxa" w:w="60"/>
+              <w:right w:type="dxa" w:w="80"/>
+            </w:tcMar>
+            <w:vAlign w:val="center"/>
+          </w:tcPr>
+          <w:p>
+            <w:pPr>
+              <w:jc w:val="center"/>
+            </w:pPr>
+          </w:p>
         </w:tc>
         <w:tc>
           <w:tcPr>
@@ -12954,8 +13495,19 @@
               <w:bottom w:val="single" w:color="000000" w:sz="4"/>
               <w:right w:val="single" w:color="000000" w:sz="4"/>
             </w:tcBorders>
-          </w:tcPr>
-          <w:p/>
+            <w:tcMar>
+              <w:top w:type="dxa" w:w="60"/>
+              <w:left w:type="dxa" w:w="80"/>
+              <w:bottom w:type="dxa" w:w="60"/>
+              <w:right w:type="dxa" w:w="80"/>
+            </w:tcMar>
+            <w:vAlign w:val="center"/>
+          </w:tcPr>
+          <w:p>
+            <w:pPr>
+              <w:jc w:val="center"/>
+            </w:pPr>
+          </w:p>
         </w:tc>
         <w:tc>
           <w:tcPr>
@@ -13464,8 +14016,19 @@
               <w:bottom w:val="single" w:color="000000" w:sz="4"/>
               <w:right w:val="single" w:color="000000" w:sz="4"/>
             </w:tcBorders>
-          </w:tcPr>
-          <w:p/>
+            <w:tcMar>
+              <w:top w:type="dxa" w:w="60"/>
+              <w:left w:type="dxa" w:w="80"/>
+              <w:bottom w:type="dxa" w:w="60"/>
+              <w:right w:type="dxa" w:w="80"/>
+            </w:tcMar>
+            <w:vAlign w:val="center"/>
+          </w:tcPr>
+          <w:p>
+            <w:pPr>
+              <w:jc w:val="center"/>
+            </w:pPr>
+          </w:p>
         </w:tc>
         <w:tc>
           <w:tcPr>
@@ -13478,8 +14041,19 @@
               <w:bottom w:val="single" w:color="000000" w:sz="4"/>
               <w:right w:val="single" w:color="000000" w:sz="4"/>
             </w:tcBorders>
-          </w:tcPr>
-          <w:p/>
+            <w:tcMar>
+              <w:top w:type="dxa" w:w="60"/>
+              <w:left w:type="dxa" w:w="80"/>
+              <w:bottom w:type="dxa" w:w="60"/>
+              <w:right w:type="dxa" w:w="80"/>
+            </w:tcMar>
+            <w:vAlign w:val="center"/>
+          </w:tcPr>
+          <w:p>
+            <w:pPr>
+              <w:jc w:val="center"/>
+            </w:pPr>
+          </w:p>
         </w:tc>
         <w:tc>
           <w:tcPr>
@@ -13988,8 +14562,19 @@
               <w:bottom w:val="single" w:color="000000" w:sz="4"/>
               <w:right w:val="single" w:color="000000" w:sz="4"/>
             </w:tcBorders>
-          </w:tcPr>
-          <w:p/>
+            <w:tcMar>
+              <w:top w:type="dxa" w:w="60"/>
+              <w:left w:type="dxa" w:w="80"/>
+              <w:bottom w:type="dxa" w:w="60"/>
+              <w:right w:type="dxa" w:w="80"/>
+            </w:tcMar>
+            <w:vAlign w:val="center"/>
+          </w:tcPr>
+          <w:p>
+            <w:pPr>
+              <w:jc w:val="center"/>
+            </w:pPr>
+          </w:p>
         </w:tc>
         <w:tc>
           <w:tcPr>
@@ -14002,8 +14587,19 @@
               <w:bottom w:val="single" w:color="000000" w:sz="4"/>
               <w:right w:val="single" w:color="000000" w:sz="4"/>
             </w:tcBorders>
-          </w:tcPr>
-          <w:p/>
+            <w:tcMar>
+              <w:top w:type="dxa" w:w="60"/>
+              <w:left w:type="dxa" w:w="80"/>
+              <w:bottom w:type="dxa" w:w="60"/>
+              <w:right w:type="dxa" w:w="80"/>
+            </w:tcMar>
+            <w:vAlign w:val="center"/>
+          </w:tcPr>
+          <w:p>
+            <w:pPr>
+              <w:jc w:val="center"/>
+            </w:pPr>
+          </w:p>
         </w:tc>
         <w:tc>
           <w:tcPr>
@@ -14512,8 +15108,19 @@
               <w:bottom w:val="single" w:color="000000" w:sz="4"/>
               <w:right w:val="single" w:color="000000" w:sz="4"/>
             </w:tcBorders>
-          </w:tcPr>
-          <w:p/>
+            <w:tcMar>
+              <w:top w:type="dxa" w:w="60"/>
+              <w:left w:type="dxa" w:w="80"/>
+              <w:bottom w:type="dxa" w:w="60"/>
+              <w:right w:type="dxa" w:w="80"/>
+            </w:tcMar>
+            <w:vAlign w:val="center"/>
+          </w:tcPr>
+          <w:p>
+            <w:pPr>
+              <w:jc w:val="center"/>
+            </w:pPr>
+          </w:p>
         </w:tc>
         <w:tc>
           <w:tcPr>
@@ -14526,8 +15133,19 @@
               <w:bottom w:val="single" w:color="000000" w:sz="4"/>
               <w:right w:val="single" w:color="000000" w:sz="4"/>
             </w:tcBorders>
-          </w:tcPr>
-          <w:p/>
+            <w:tcMar>
+              <w:top w:type="dxa" w:w="60"/>
+              <w:left w:type="dxa" w:w="80"/>
+              <w:bottom w:type="dxa" w:w="60"/>
+              <w:right w:type="dxa" w:w="80"/>
+            </w:tcMar>
+            <w:vAlign w:val="center"/>
+          </w:tcPr>
+          <w:p>
+            <w:pPr>
+              <w:jc w:val="center"/>
+            </w:pPr>
+          </w:p>
         </w:tc>
         <w:tc>
           <w:tcPr>
@@ -15036,8 +15654,19 @@
               <w:bottom w:val="single" w:color="000000" w:sz="4"/>
               <w:right w:val="single" w:color="000000" w:sz="4"/>
             </w:tcBorders>
-          </w:tcPr>
-          <w:p/>
+            <w:tcMar>
+              <w:top w:type="dxa" w:w="60"/>
+              <w:left w:type="dxa" w:w="80"/>
+              <w:bottom w:type="dxa" w:w="60"/>
+              <w:right w:type="dxa" w:w="80"/>
+            </w:tcMar>
+            <w:vAlign w:val="center"/>
+          </w:tcPr>
+          <w:p>
+            <w:pPr>
+              <w:jc w:val="center"/>
+            </w:pPr>
+          </w:p>
         </w:tc>
         <w:tc>
           <w:tcPr>
@@ -15050,8 +15679,19 @@
               <w:bottom w:val="single" w:color="000000" w:sz="4"/>
               <w:right w:val="single" w:color="000000" w:sz="4"/>
             </w:tcBorders>
-          </w:tcPr>
-          <w:p/>
+            <w:tcMar>
+              <w:top w:type="dxa" w:w="60"/>
+              <w:left w:type="dxa" w:w="80"/>
+              <w:bottom w:type="dxa" w:w="60"/>
+              <w:right w:type="dxa" w:w="80"/>
+            </w:tcMar>
+            <w:vAlign w:val="center"/>
+          </w:tcPr>
+          <w:p>
+            <w:pPr>
+              <w:jc w:val="center"/>
+            </w:pPr>
+          </w:p>
         </w:tc>
         <w:tc>
           <w:tcPr>
@@ -15560,8 +16200,19 @@
               <w:bottom w:val="single" w:color="000000" w:sz="4"/>
               <w:right w:val="single" w:color="000000" w:sz="4"/>
             </w:tcBorders>
-          </w:tcPr>
-          <w:p/>
+            <w:tcMar>
+              <w:top w:type="dxa" w:w="60"/>
+              <w:left w:type="dxa" w:w="80"/>
+              <w:bottom w:type="dxa" w:w="60"/>
+              <w:right w:type="dxa" w:w="80"/>
+            </w:tcMar>
+            <w:vAlign w:val="center"/>
+          </w:tcPr>
+          <w:p>
+            <w:pPr>
+              <w:jc w:val="center"/>
+            </w:pPr>
+          </w:p>
         </w:tc>
         <w:tc>
           <w:tcPr>
@@ -15574,8 +16225,19 @@
               <w:bottom w:val="single" w:color="000000" w:sz="4"/>
               <w:right w:val="single" w:color="000000" w:sz="4"/>
             </w:tcBorders>
-          </w:tcPr>
-          <w:p/>
+            <w:tcMar>
+              <w:top w:type="dxa" w:w="60"/>
+              <w:left w:type="dxa" w:w="80"/>
+              <w:bottom w:type="dxa" w:w="60"/>
+              <w:right w:type="dxa" w:w="80"/>
+            </w:tcMar>
+            <w:vAlign w:val="center"/>
+          </w:tcPr>
+          <w:p>
+            <w:pPr>
+              <w:jc w:val="center"/>
+            </w:pPr>
+          </w:p>
         </w:tc>
         <w:tc>
           <w:tcPr>
@@ -16084,8 +16746,19 @@
               <w:bottom w:val="single" w:color="000000" w:sz="4"/>
               <w:right w:val="single" w:color="000000" w:sz="4"/>
             </w:tcBorders>
-          </w:tcPr>
-          <w:p/>
+            <w:tcMar>
+              <w:top w:type="dxa" w:w="60"/>
+              <w:left w:type="dxa" w:w="80"/>
+              <w:bottom w:type="dxa" w:w="60"/>
+              <w:right w:type="dxa" w:w="80"/>
+            </w:tcMar>
+            <w:vAlign w:val="center"/>
+          </w:tcPr>
+          <w:p>
+            <w:pPr>
+              <w:jc w:val="center"/>
+            </w:pPr>
+          </w:p>
         </w:tc>
         <w:tc>
           <w:tcPr>
@@ -16098,8 +16771,19 @@
               <w:bottom w:val="single" w:color="000000" w:sz="4"/>
               <w:right w:val="single" w:color="000000" w:sz="4"/>
             </w:tcBorders>
-          </w:tcPr>
-          <w:p/>
+            <w:tcMar>
+              <w:top w:type="dxa" w:w="60"/>
+              <w:left w:type="dxa" w:w="80"/>
+              <w:bottom w:type="dxa" w:w="60"/>
+              <w:right w:type="dxa" w:w="80"/>
+            </w:tcMar>
+            <w:vAlign w:val="center"/>
+          </w:tcPr>
+          <w:p>
+            <w:pPr>
+              <w:jc w:val="center"/>
+            </w:pPr>
+          </w:p>
         </w:tc>
         <w:tc>
           <w:tcPr>
@@ -16608,8 +17292,19 @@
               <w:bottom w:val="single" w:color="000000" w:sz="4"/>
               <w:right w:val="single" w:color="000000" w:sz="4"/>
             </w:tcBorders>
-          </w:tcPr>
-          <w:p/>
+            <w:tcMar>
+              <w:top w:type="dxa" w:w="60"/>
+              <w:left w:type="dxa" w:w="80"/>
+              <w:bottom w:type="dxa" w:w="60"/>
+              <w:right w:type="dxa" w:w="80"/>
+            </w:tcMar>
+            <w:vAlign w:val="center"/>
+          </w:tcPr>
+          <w:p>
+            <w:pPr>
+              <w:jc w:val="center"/>
+            </w:pPr>
+          </w:p>
         </w:tc>
         <w:tc>
           <w:tcPr>
@@ -16622,8 +17317,19 @@
               <w:bottom w:val="single" w:color="000000" w:sz="4"/>
               <w:right w:val="single" w:color="000000" w:sz="4"/>
             </w:tcBorders>
-          </w:tcPr>
-          <w:p/>
+            <w:tcMar>
+              <w:top w:type="dxa" w:w="60"/>
+              <w:left w:type="dxa" w:w="80"/>
+              <w:bottom w:type="dxa" w:w="60"/>
+              <w:right w:type="dxa" w:w="80"/>
+            </w:tcMar>
+            <w:vAlign w:val="center"/>
+          </w:tcPr>
+          <w:p>
+            <w:pPr>
+              <w:jc w:val="center"/>
+            </w:pPr>
+          </w:p>
         </w:tc>
         <w:tc>
           <w:tcPr>
@@ -17132,8 +17838,19 @@
               <w:bottom w:val="single" w:color="000000" w:sz="4"/>
               <w:right w:val="single" w:color="000000" w:sz="4"/>
             </w:tcBorders>
-          </w:tcPr>
-          <w:p/>
+            <w:tcMar>
+              <w:top w:type="dxa" w:w="60"/>
+              <w:left w:type="dxa" w:w="80"/>
+              <w:bottom w:type="dxa" w:w="60"/>
+              <w:right w:type="dxa" w:w="80"/>
+            </w:tcMar>
+            <w:vAlign w:val="center"/>
+          </w:tcPr>
+          <w:p>
+            <w:pPr>
+              <w:jc w:val="center"/>
+            </w:pPr>
+          </w:p>
         </w:tc>
         <w:tc>
           <w:tcPr>
@@ -17146,8 +17863,19 @@
               <w:bottom w:val="single" w:color="000000" w:sz="4"/>
               <w:right w:val="single" w:color="000000" w:sz="4"/>
             </w:tcBorders>
-          </w:tcPr>
-          <w:p/>
+            <w:tcMar>
+              <w:top w:type="dxa" w:w="60"/>
+              <w:left w:type="dxa" w:w="80"/>
+              <w:bottom w:type="dxa" w:w="60"/>
+              <w:right w:type="dxa" w:w="80"/>
+            </w:tcMar>
+            <w:vAlign w:val="center"/>
+          </w:tcPr>
+          <w:p>
+            <w:pPr>
+              <w:jc w:val="center"/>
+            </w:pPr>
+          </w:p>
         </w:tc>
         <w:tc>
           <w:tcPr>
@@ -17656,8 +18384,19 @@
               <w:bottom w:val="single" w:color="000000" w:sz="4"/>
               <w:right w:val="single" w:color="000000" w:sz="4"/>
             </w:tcBorders>
-          </w:tcPr>
-          <w:p/>
+            <w:tcMar>
+              <w:top w:type="dxa" w:w="60"/>
+              <w:left w:type="dxa" w:w="80"/>
+              <w:bottom w:type="dxa" w:w="60"/>
+              <w:right w:type="dxa" w:w="80"/>
+            </w:tcMar>
+            <w:vAlign w:val="center"/>
+          </w:tcPr>
+          <w:p>
+            <w:pPr>
+              <w:jc w:val="center"/>
+            </w:pPr>
+          </w:p>
         </w:tc>
         <w:tc>
           <w:tcPr>
@@ -17670,8 +18409,19 @@
               <w:bottom w:val="single" w:color="000000" w:sz="4"/>
               <w:right w:val="single" w:color="000000" w:sz="4"/>
             </w:tcBorders>
-          </w:tcPr>
-          <w:p/>
+            <w:tcMar>
+              <w:top w:type="dxa" w:w="60"/>
+              <w:left w:type="dxa" w:w="80"/>
+              <w:bottom w:type="dxa" w:w="60"/>
+              <w:right w:type="dxa" w:w="80"/>
+            </w:tcMar>
+            <w:vAlign w:val="center"/>
+          </w:tcPr>
+          <w:p>
+            <w:pPr>
+              <w:jc w:val="center"/>
+            </w:pPr>
+          </w:p>
         </w:tc>
         <w:tc>
           <w:tcPr>

</xml_diff>

<commit_message>
📄 Actualizar registro Word [23-10-2026 07:25]
</commit_message>
<xml_diff>
--- a/registro_2026.docx
+++ b/registro_2026.docx
@@ -19012,6 +19012,139 @@
     <w:basedOn w:val="Normal"/>
     <w:qFormat/>
   </w:style>
+  <w:style w:type="paragraph" w:styleId="Caption">
+    <w:name w:val="caption"/>
+    <w:basedOn w:val="Normal"/>
+    <w:next w:val="Normal"/>
+    <w:uiPriority w:val="35"/>
+    <w:semiHidden/>
+    <w:unhideWhenUsed/>
+    <w:qFormat/>
+    <w:pPr>
+      <w:spacing w:after="200"/>
+    </w:pPr>
+    <w:rPr>
+      <w:i/>
+      <w:iCs/>
+      <w:color w:val="44546A" w:themeColor="dark2"/>
+      <w:sz w:val="18"/>
+      <w:szCs w:val="18"/>
+    </w:rPr>
+  </w:style>
+  <w:style w:type="paragraph" w:styleId="Bibliography">
+    <w:name w:val="Bibliography"/>
+    <w:basedOn w:val="Normal"/>
+    <w:next w:val="Normal"/>
+    <w:uiPriority w:val="37"/>
+    <w:unhideWhenUsed/>
+  </w:style>
+  <w:style w:type="paragraph" w:styleId="TOC1">
+    <w:name w:val="toc 1"/>
+    <w:basedOn w:val="Normal"/>
+    <w:next w:val="Normal"/>
+    <w:uiPriority w:val="39"/>
+    <w:semiHidden/>
+    <w:unhideWhenUsed/>
+    <w:pPr>
+      <w:spacing w:after="100"/>
+    </w:pPr>
+  </w:style>
+  <w:style w:type="paragraph" w:styleId="TOC2">
+    <w:name w:val="toc 2"/>
+    <w:basedOn w:val="Normal"/>
+    <w:next w:val="Normal"/>
+    <w:uiPriority w:val="39"/>
+    <w:semiHidden/>
+    <w:unhideWhenUsed/>
+    <w:pPr>
+      <w:spacing w:after="100"/>
+      <w:ind w:left="200"/>
+    </w:pPr>
+  </w:style>
+  <w:style w:type="paragraph" w:styleId="TOC3">
+    <w:name w:val="toc 3"/>
+    <w:basedOn w:val="Normal"/>
+    <w:next w:val="Normal"/>
+    <w:uiPriority w:val="39"/>
+    <w:semiHidden/>
+    <w:unhideWhenUsed/>
+    <w:pPr>
+      <w:spacing w:after="100"/>
+      <w:ind w:left="400"/>
+    </w:pPr>
+  </w:style>
+  <w:style w:type="paragraph" w:styleId="TOC4">
+    <w:name w:val="toc 4"/>
+    <w:basedOn w:val="Normal"/>
+    <w:next w:val="Normal"/>
+    <w:uiPriority w:val="39"/>
+    <w:semiHidden/>
+    <w:unhideWhenUsed/>
+    <w:pPr>
+      <w:spacing w:after="100"/>
+      <w:ind w:left="600"/>
+    </w:pPr>
+  </w:style>
+  <w:style w:type="paragraph" w:styleId="TOC5">
+    <w:name w:val="toc 5"/>
+    <w:basedOn w:val="Normal"/>
+    <w:next w:val="Normal"/>
+    <w:uiPriority w:val="39"/>
+    <w:semiHidden/>
+    <w:unhideWhenUsed/>
+    <w:pPr>
+      <w:spacing w:after="100"/>
+      <w:ind w:left="800"/>
+    </w:pPr>
+  </w:style>
+  <w:style w:type="paragraph" w:styleId="TOC6">
+    <w:name w:val="toc 6"/>
+    <w:basedOn w:val="Normal"/>
+    <w:next w:val="Normal"/>
+    <w:uiPriority w:val="39"/>
+    <w:semiHidden/>
+    <w:unhideWhenUsed/>
+    <w:pPr>
+      <w:spacing w:after="100"/>
+      <w:ind w:left="1000"/>
+    </w:pPr>
+  </w:style>
+  <w:style w:type="paragraph" w:styleId="TOC7">
+    <w:name w:val="toc 7"/>
+    <w:basedOn w:val="Normal"/>
+    <w:next w:val="Normal"/>
+    <w:uiPriority w:val="39"/>
+    <w:semiHidden/>
+    <w:unhideWhenUsed/>
+    <w:pPr>
+      <w:spacing w:after="100"/>
+      <w:ind w:left="1200"/>
+    </w:pPr>
+  </w:style>
+  <w:style w:type="paragraph" w:styleId="TOC8">
+    <w:name w:val="toc 8"/>
+    <w:basedOn w:val="Normal"/>
+    <w:next w:val="Normal"/>
+    <w:uiPriority w:val="39"/>
+    <w:semiHidden/>
+    <w:unhideWhenUsed/>
+    <w:pPr>
+      <w:spacing w:after="100"/>
+      <w:ind w:left="1400"/>
+    </w:pPr>
+  </w:style>
+  <w:style w:type="paragraph" w:styleId="TOC9">
+    <w:name w:val="toc 9"/>
+    <w:basedOn w:val="Normal"/>
+    <w:next w:val="Normal"/>
+    <w:uiPriority w:val="39"/>
+    <w:semiHidden/>
+    <w:unhideWhenUsed/>
+    <w:pPr>
+      <w:spacing w:after="100"/>
+      <w:ind w:left="1600"/>
+    </w:pPr>
+  </w:style>
   <w:style w:type="character" w:styleId="Hyperlink">
     <w:name w:val="Hyperlink"/>
     <w:basedOn w:val="DefaultParagraphFont"/>
@@ -19095,6 +19228,13 @@
       <w:sz w:val="20"/>
       <w:szCs w:val="20"/>
     </w:rPr>
+  </w:style>
+  <w:style w:type="character" w:styleId="LineNumber">
+    <w:name w:val="line number"/>
+    <w:basedOn w:val="DefaultParagraphFont"/>
+    <w:uiPriority w:val="99"/>
+    <w:semiHidden/>
+    <w:unhideWhenUsed/>
   </w:style>
 </w:styles>
 </file>

</xml_diff>